<commit_message>
feat: Agrega Punto 3 - Aplicación de patrones de diseño (Singleton, Observer, Factory, MVC)
</commit_message>
<xml_diff>
--- a/Actividad#1/Actividad_1_Danny_Balladares.docx
+++ b/Actividad#1/Actividad_1_Danny_Balladares.docx
@@ -1041,23 +1041,13 @@
           </wp:anchor>
         </w:drawing>
       </w:r>
-      <w:proofErr w:type="gramStart"/>
       <w:r>
         <w:rPr>
           <w:rFonts w:ascii="Arial" w:hAnsi="Arial" w:cs="Arial"/>
           <w:b/>
           <w:sz w:val="28"/>
         </w:rPr>
-        <w:t>Actividades a desarrollar</w:t>
-      </w:r>
-      <w:proofErr w:type="gramEnd"/>
-      <w:r>
-        <w:rPr>
-          <w:rFonts w:ascii="Arial" w:hAnsi="Arial" w:cs="Arial"/>
-          <w:b/>
-          <w:sz w:val="28"/>
-        </w:rPr>
-        <w:t xml:space="preserve"> en la </w:t>
+        <w:t xml:space="preserve">Actividades a desarrollar en la </w:t>
       </w:r>
       <w:r>
         <w:rPr>
@@ -1371,23 +1361,7 @@
           <w:rFonts w:ascii="Arial" w:hAnsi="Arial" w:cs="Arial"/>
           <w:lang w:eastAsia="es-EC"/>
         </w:rPr>
-        <w:t xml:space="preserve"> de incidentes, siendo responsable de crear y documentar solicitudes técnicas, así como realizar seguimiento de sus </w:t>
-      </w:r>
-      <w:proofErr w:type="gramStart"/>
-      <w:r>
-        <w:rPr>
-          <w:rFonts w:ascii="Arial" w:hAnsi="Arial" w:cs="Arial"/>
-          <w:lang w:eastAsia="es-EC"/>
-        </w:rPr>
-        <w:t>tickets</w:t>
-      </w:r>
-      <w:proofErr w:type="gramEnd"/>
-      <w:r>
-        <w:rPr>
-          <w:rFonts w:ascii="Arial" w:hAnsi="Arial" w:cs="Arial"/>
-          <w:lang w:eastAsia="es-EC"/>
-        </w:rPr>
-        <w:t xml:space="preserve">. </w:t>
+        <w:t xml:space="preserve"> de incidentes, siendo responsable de crear y documentar solicitudes técnicas, así como realizar seguimiento de sus tickets. </w:t>
       </w:r>
     </w:p>
     <w:p>
@@ -1720,23 +1694,7 @@
                 <w:rFonts w:ascii="Arial" w:eastAsia="Times New Roman" w:hAnsi="Arial" w:cs="Arial"/>
                 <w:lang w:val="es-ES" w:eastAsia="es-ES"/>
               </w:rPr>
-              <w:t xml:space="preserve">Crear incidentes, ver estado de sus propios </w:t>
-            </w:r>
-            <w:proofErr w:type="gramStart"/>
-            <w:r>
-              <w:rPr>
-                <w:rFonts w:ascii="Arial" w:eastAsia="Times New Roman" w:hAnsi="Arial" w:cs="Arial"/>
-                <w:lang w:val="es-ES" w:eastAsia="es-ES"/>
-              </w:rPr>
-              <w:t>tickets</w:t>
-            </w:r>
-            <w:proofErr w:type="gramEnd"/>
-            <w:r>
-              <w:rPr>
-                <w:rFonts w:ascii="Arial" w:eastAsia="Times New Roman" w:hAnsi="Arial" w:cs="Arial"/>
-                <w:lang w:val="es-ES" w:eastAsia="es-ES"/>
-              </w:rPr>
-              <w:t>, añadir comentarios a sus incidentes</w:t>
+              <w:t>Crear incidentes, ver estado de sus propios tickets, añadir comentarios a sus incidentes</w:t>
             </w:r>
           </w:p>
         </w:tc>
@@ -1803,23 +1761,7 @@
                 <w:rFonts w:ascii="Arial" w:eastAsia="Times New Roman" w:hAnsi="Arial" w:cs="Arial"/>
                 <w:lang w:val="es-ES" w:eastAsia="es-ES"/>
               </w:rPr>
-              <w:t xml:space="preserve">Recibir y revisar incidentes asignados; diagnosticar problemas; ejecutar soluciones; actualizar el estado de los </w:t>
-            </w:r>
-            <w:proofErr w:type="gramStart"/>
-            <w:r>
-              <w:rPr>
-                <w:rFonts w:ascii="Arial" w:eastAsia="Times New Roman" w:hAnsi="Arial" w:cs="Arial"/>
-                <w:lang w:val="es-ES" w:eastAsia="es-ES"/>
-              </w:rPr>
-              <w:t>tickets</w:t>
-            </w:r>
-            <w:proofErr w:type="gramEnd"/>
-            <w:r>
-              <w:rPr>
-                <w:rFonts w:ascii="Arial" w:eastAsia="Times New Roman" w:hAnsi="Arial" w:cs="Arial"/>
-                <w:lang w:val="es-ES" w:eastAsia="es-ES"/>
-              </w:rPr>
-              <w:t>; documentar acciones realizadas</w:t>
+              <w:t>Recibir y revisar incidentes asignados; diagnosticar problemas; ejecutar soluciones; actualizar el estado de los tickets; documentar acciones realizadas</w:t>
             </w:r>
           </w:p>
         </w:tc>
@@ -2245,23 +2187,7 @@
                 <w:rFonts w:ascii="Arial" w:eastAsia="Times New Roman" w:hAnsi="Arial" w:cs="Arial"/>
                 <w:lang w:val="es-ES" w:eastAsia="es-ES"/>
               </w:rPr>
-              <w:t xml:space="preserve">El sistema debe asignar </w:t>
-            </w:r>
-            <w:proofErr w:type="gramStart"/>
-            <w:r>
-              <w:rPr>
-                <w:rFonts w:ascii="Arial" w:eastAsia="Times New Roman" w:hAnsi="Arial" w:cs="Arial"/>
-                <w:lang w:val="es-ES" w:eastAsia="es-ES"/>
-              </w:rPr>
-              <w:t>automáticamente o manualmente</w:t>
-            </w:r>
-            <w:proofErr w:type="gramEnd"/>
-            <w:r>
-              <w:rPr>
-                <w:rFonts w:ascii="Arial" w:eastAsia="Times New Roman" w:hAnsi="Arial" w:cs="Arial"/>
-                <w:lang w:val="es-ES" w:eastAsia="es-ES"/>
-              </w:rPr>
-              <w:t xml:space="preserve"> incidentes a técnicos disponibles</w:t>
+              <w:t>El sistema debe asignar automáticamente o manualmente incidentes a técnicos disponibles</w:t>
             </w:r>
           </w:p>
         </w:tc>
@@ -3354,25 +3280,106 @@
     </w:p>
     <w:p>
       <w:pPr>
-        <w:rPr>
-          <w:rFonts w:ascii="Arial" w:hAnsi="Arial" w:cs="Arial"/>
-          <w:b/>
-          <w:bCs/>
-          <w:lang w:eastAsia="es-EC"/>
-        </w:rPr>
-      </w:pPr>
-      <w:r>
-        <w:rPr>
-          <w:rFonts w:ascii="Arial" w:hAnsi="Arial" w:cs="Arial"/>
-          <w:b/>
-          <w:bCs/>
-          <w:lang w:eastAsia="es-EC"/>
-        </w:rPr>
-        <w:t>(VAS A REDACTAR EN UN PARRAFO O 2 LO QUE SE VA A REALIZAR PARRA DESARROLLAR EL SISTEMA)</w:t>
+        <w:spacing w:line="360" w:lineRule="auto"/>
+        <w:ind w:firstLine="709"/>
+        <w:jc w:val="both"/>
+        <w:rPr>
+          <w:rFonts w:ascii="Arial" w:hAnsi="Arial" w:cs="Arial"/>
+          <w:lang w:eastAsia="es-EC"/>
+        </w:rPr>
+      </w:pPr>
+      <w:r>
+        <w:rPr>
+          <w:rFonts w:ascii="Arial" w:hAnsi="Arial" w:cs="Arial"/>
+          <w:lang w:eastAsia="es-EC"/>
+        </w:rPr>
+        <w:t xml:space="preserve">El diseño del sistema de gestión de incidentes se fundamenta en una arquitectura modular que integra patrones de diseño reconocidos y mejores prácticas de ingeniería de software. De acuerdo con los principios establecidos por Serrano Preciado et al. (2024), el desarrollo de un sistema Help </w:t>
+      </w:r>
+      <w:proofErr w:type="spellStart"/>
+      <w:r>
+        <w:rPr>
+          <w:rFonts w:ascii="Arial" w:hAnsi="Arial" w:cs="Arial"/>
+          <w:lang w:eastAsia="es-EC"/>
+        </w:rPr>
+        <w:t>Desk</w:t>
+      </w:r>
+      <w:proofErr w:type="spellEnd"/>
+      <w:r>
+        <w:rPr>
+          <w:rFonts w:ascii="Arial" w:hAnsi="Arial" w:cs="Arial"/>
+          <w:lang w:eastAsia="es-EC"/>
+        </w:rPr>
+        <w:t xml:space="preserve"> requiere un enfoque estructurado que combine claridad en la especificación de componentes, flexibilidad en la implementación y escalabilidad para futuras extensiones. </w:t>
       </w:r>
     </w:p>
     <w:p>
       <w:pPr>
+        <w:spacing w:line="360" w:lineRule="auto"/>
+        <w:ind w:firstLine="709"/>
+        <w:jc w:val="both"/>
+        <w:rPr>
+          <w:rFonts w:ascii="Arial" w:hAnsi="Arial" w:cs="Arial"/>
+          <w:lang w:eastAsia="es-EC"/>
+        </w:rPr>
+      </w:pPr>
+      <w:r>
+        <w:rPr>
+          <w:rFonts w:ascii="Arial" w:hAnsi="Arial" w:cs="Arial"/>
+          <w:lang w:eastAsia="es-EC"/>
+        </w:rPr>
+        <w:t xml:space="preserve">Para esto, se utiliza un repositorio centralizado con control de versiones mediante </w:t>
+      </w:r>
+      <w:proofErr w:type="spellStart"/>
+      <w:r>
+        <w:rPr>
+          <w:rFonts w:ascii="Arial" w:hAnsi="Arial" w:cs="Arial"/>
+          <w:lang w:eastAsia="es-EC"/>
+        </w:rPr>
+        <w:t>Gitflow</w:t>
+      </w:r>
+      <w:proofErr w:type="spellEnd"/>
+      <w:r>
+        <w:rPr>
+          <w:rFonts w:ascii="Arial" w:hAnsi="Arial" w:cs="Arial"/>
+          <w:lang w:eastAsia="es-EC"/>
+        </w:rPr>
+        <w:t xml:space="preserve">, que permite la colaboración ordenada entre desarrolladores. Además, se implementan diagramas UML que visualizan la interacción entre componentes, casos de uso que representan las funcionalidades del sistema, y una arquitectura general que define cómo se integran los módulos de </w:t>
+      </w:r>
+      <w:proofErr w:type="spellStart"/>
+      <w:r>
+        <w:rPr>
+          <w:rFonts w:ascii="Arial" w:hAnsi="Arial" w:cs="Arial"/>
+          <w:lang w:eastAsia="es-EC"/>
+        </w:rPr>
+        <w:t>backend</w:t>
+      </w:r>
+      <w:proofErr w:type="spellEnd"/>
+      <w:r>
+        <w:rPr>
+          <w:rFonts w:ascii="Arial" w:hAnsi="Arial" w:cs="Arial"/>
+          <w:lang w:eastAsia="es-EC"/>
+        </w:rPr>
+        <w:t xml:space="preserve">, </w:t>
+      </w:r>
+      <w:proofErr w:type="spellStart"/>
+      <w:r>
+        <w:rPr>
+          <w:rFonts w:ascii="Arial" w:hAnsi="Arial" w:cs="Arial"/>
+          <w:lang w:eastAsia="es-EC"/>
+        </w:rPr>
+        <w:t>frontend</w:t>
+      </w:r>
+      <w:proofErr w:type="spellEnd"/>
+      <w:r>
+        <w:rPr>
+          <w:rFonts w:ascii="Arial" w:hAnsi="Arial" w:cs="Arial"/>
+          <w:lang w:eastAsia="es-EC"/>
+        </w:rPr>
+        <w:t xml:space="preserve"> y base de datos. Este enfoque integral garantiza que el sistema sea robusto, mantenible y capaz de adaptarse a los requisitos cambiantes de la organización.</w:t>
+      </w:r>
+    </w:p>
+    <w:p>
+      <w:pPr>
         <w:ind w:firstLine="708"/>
         <w:rPr>
           <w:rFonts w:ascii="Arial" w:hAnsi="Arial" w:cs="Arial"/>
@@ -3388,6 +3395,7 @@
           <w:bCs/>
           <w:lang w:eastAsia="es-EC"/>
         </w:rPr>
+        <w:lastRenderedPageBreak/>
         <w:t xml:space="preserve">2.1 </w:t>
       </w:r>
       <w:r>
@@ -3430,18 +3438,66 @@
           <w:sz w:val="20"/>
           <w:szCs w:val="20"/>
         </w:rPr>
-        <w:t>(ESPACIO PARA IMAGEN Y UNA PEQUEÑA DESCRIPCION)</w:t>
+        <w:drawing>
+          <wp:inline distT="0" distB="0" distL="0" distR="0" wp14:anchorId="7BFF71B4" wp14:editId="561337F6">
+            <wp:extent cx="5400040" cy="2946400"/>
+            <wp:effectExtent l="0" t="0" r="0" b="6350"/>
+            <wp:docPr id="1897416084" name="Imagen 1"/>
+            <wp:cNvGraphicFramePr>
+              <a:graphicFrameLocks xmlns:a="http://schemas.openxmlformats.org/drawingml/2006/main" noChangeAspect="1"/>
+            </wp:cNvGraphicFramePr>
+            <a:graphic xmlns:a="http://schemas.openxmlformats.org/drawingml/2006/main">
+              <a:graphicData uri="http://schemas.openxmlformats.org/drawingml/2006/picture">
+                <pic:pic xmlns:pic="http://schemas.openxmlformats.org/drawingml/2006/picture">
+                  <pic:nvPicPr>
+                    <pic:cNvPr id="1897416084" name=""/>
+                    <pic:cNvPicPr/>
+                  </pic:nvPicPr>
+                  <pic:blipFill>
+                    <a:blip r:embed="rId14"/>
+                    <a:stretch>
+                      <a:fillRect/>
+                    </a:stretch>
+                  </pic:blipFill>
+                  <pic:spPr>
+                    <a:xfrm>
+                      <a:off x="0" y="0"/>
+                      <a:ext cx="5400040" cy="2946400"/>
+                    </a:xfrm>
+                    <a:prstGeom prst="rect">
+                      <a:avLst/>
+                    </a:prstGeom>
+                  </pic:spPr>
+                </pic:pic>
+              </a:graphicData>
+            </a:graphic>
+          </wp:inline>
+        </w:drawing>
       </w:r>
     </w:p>
     <w:p>
       <w:pPr>
-        <w:rPr>
-          <w:rFonts w:ascii="Arial" w:hAnsi="Arial" w:cs="Arial"/>
-          <w:b/>
-          <w:bCs/>
-          <w:lang w:eastAsia="es-EC"/>
-        </w:rPr>
-      </w:pPr>
+        <w:jc w:val="center"/>
+        <w:rPr>
+          <w:rFonts w:ascii="Arial" w:hAnsi="Arial" w:cs="Arial"/>
+          <w:i/>
+          <w:iCs/>
+          <w:sz w:val="20"/>
+          <w:szCs w:val="20"/>
+          <w:lang w:eastAsia="es-EC"/>
+        </w:rPr>
+      </w:pPr>
+      <w:r>
+        <w:rPr>
+          <w:rFonts w:ascii="Arial" w:hAnsi="Arial" w:cs="Arial"/>
+          <w:i/>
+          <w:iCs/>
+          <w:sz w:val="20"/>
+          <w:szCs w:val="20"/>
+          <w:lang w:eastAsia="es-EC"/>
+        </w:rPr>
+        <w:t>Se creo el repositorio en GitHub</w:t>
+      </w:r>
     </w:p>
     <w:p>
       <w:pPr>
@@ -3504,21 +3560,218 @@
           <w:sz w:val="20"/>
           <w:szCs w:val="20"/>
         </w:rPr>
-        <w:t>(ESPACIO PARA IMAGEN Y UNA PEQUEÑA DESCRIPCION)</w:t>
+        <w:drawing>
+          <wp:inline distT="0" distB="0" distL="0" distR="0" wp14:anchorId="0536F3D7" wp14:editId="3F0903FD">
+            <wp:extent cx="5400040" cy="3892550"/>
+            <wp:effectExtent l="0" t="0" r="0" b="0"/>
+            <wp:docPr id="444494420" name="Imagen 1"/>
+            <wp:cNvGraphicFramePr>
+              <a:graphicFrameLocks xmlns:a="http://schemas.openxmlformats.org/drawingml/2006/main" noChangeAspect="1"/>
+            </wp:cNvGraphicFramePr>
+            <a:graphic xmlns:a="http://schemas.openxmlformats.org/drawingml/2006/main">
+              <a:graphicData uri="http://schemas.openxmlformats.org/drawingml/2006/picture">
+                <pic:pic xmlns:pic="http://schemas.openxmlformats.org/drawingml/2006/picture">
+                  <pic:nvPicPr>
+                    <pic:cNvPr id="444494420" name=""/>
+                    <pic:cNvPicPr/>
+                  </pic:nvPicPr>
+                  <pic:blipFill>
+                    <a:blip r:embed="rId15"/>
+                    <a:stretch>
+                      <a:fillRect/>
+                    </a:stretch>
+                  </pic:blipFill>
+                  <pic:spPr>
+                    <a:xfrm>
+                      <a:off x="0" y="0"/>
+                      <a:ext cx="5400040" cy="3892550"/>
+                    </a:xfrm>
+                    <a:prstGeom prst="rect">
+                      <a:avLst/>
+                    </a:prstGeom>
+                  </pic:spPr>
+                </pic:pic>
+              </a:graphicData>
+            </a:graphic>
+          </wp:inline>
+        </w:drawing>
       </w:r>
     </w:p>
     <w:p>
       <w:pPr>
-        <w:rPr>
-          <w:rFonts w:ascii="Arial" w:hAnsi="Arial" w:cs="Arial"/>
-          <w:b/>
-          <w:bCs/>
-          <w:lang w:eastAsia="es-EC"/>
-        </w:rPr>
-      </w:pPr>
+        <w:widowControl w:val="0"/>
+        <w:pBdr>
+          <w:top w:val="nil"/>
+          <w:left w:val="nil"/>
+          <w:bottom w:val="nil"/>
+          <w:right w:val="nil"/>
+          <w:between w:val="nil"/>
+        </w:pBdr>
+        <w:spacing w:line="240" w:lineRule="auto"/>
+        <w:jc w:val="center"/>
+        <w:rPr>
+          <w:rFonts w:ascii="Arial" w:eastAsia="Arial" w:hAnsi="Arial" w:cs="Arial"/>
+          <w:i/>
+          <w:iCs/>
+          <w:color w:val="000000"/>
+          <w:sz w:val="20"/>
+          <w:szCs w:val="20"/>
+        </w:rPr>
+      </w:pPr>
+      <w:r>
+        <w:rPr>
+          <w:rFonts w:ascii="Arial" w:eastAsia="Arial" w:hAnsi="Arial" w:cs="Arial"/>
+          <w:i/>
+          <w:iCs/>
+          <w:color w:val="000000"/>
+          <w:sz w:val="20"/>
+          <w:szCs w:val="20"/>
+        </w:rPr>
+        <w:t>Se crearon las diferentes ramas</w:t>
+      </w:r>
     </w:p>
     <w:p>
       <w:pPr>
+        <w:widowControl w:val="0"/>
+        <w:pBdr>
+          <w:top w:val="nil"/>
+          <w:left w:val="nil"/>
+          <w:bottom w:val="nil"/>
+          <w:right w:val="nil"/>
+          <w:between w:val="nil"/>
+        </w:pBdr>
+        <w:spacing w:after="0" w:line="360" w:lineRule="auto"/>
+        <w:ind w:firstLine="709"/>
+        <w:jc w:val="both"/>
+        <w:rPr>
+          <w:rFonts w:ascii="Arial" w:eastAsia="Arial" w:hAnsi="Arial" w:cs="Arial"/>
+          <w:color w:val="000000"/>
+        </w:rPr>
+      </w:pPr>
+      <w:proofErr w:type="spellStart"/>
+      <w:r>
+        <w:rPr>
+          <w:rFonts w:ascii="Arial" w:eastAsia="Arial" w:hAnsi="Arial" w:cs="Arial"/>
+          <w:color w:val="000000"/>
+        </w:rPr>
+        <w:t>Gitflow</w:t>
+      </w:r>
+      <w:proofErr w:type="spellEnd"/>
+      <w:r>
+        <w:rPr>
+          <w:rFonts w:ascii="Arial" w:eastAsia="Arial" w:hAnsi="Arial" w:cs="Arial"/>
+          <w:color w:val="000000"/>
+        </w:rPr>
+        <w:t xml:space="preserve"> es un modelo de ramificación que establece un flujo de trabajo estructurado para el desarrollo colaborativo. Como señala </w:t>
+      </w:r>
+      <w:proofErr w:type="spellStart"/>
+      <w:r>
+        <w:rPr>
+          <w:rFonts w:ascii="Arial" w:eastAsia="Arial" w:hAnsi="Arial" w:cs="Arial"/>
+          <w:color w:val="000000"/>
+        </w:rPr>
+        <w:t>Atlassian</w:t>
+      </w:r>
+      <w:proofErr w:type="spellEnd"/>
+      <w:r>
+        <w:rPr>
+          <w:rFonts w:ascii="Arial" w:eastAsia="Arial" w:hAnsi="Arial" w:cs="Arial"/>
+          <w:color w:val="000000"/>
+        </w:rPr>
+        <w:t xml:space="preserve"> (s.f.), este enfoque define ramas específicas para desarrollo, lanzamiento y producción, permitiendo que </w:t>
+      </w:r>
+      <w:r>
+        <w:rPr>
+          <w:rFonts w:ascii="Arial" w:eastAsia="Arial" w:hAnsi="Arial" w:cs="Arial"/>
+          <w:color w:val="000000"/>
+        </w:rPr>
+        <w:lastRenderedPageBreak/>
+        <w:t xml:space="preserve">múltiples desarrolladores trabajen simultáneamente sin conflictos. El flujo incluye la rama </w:t>
+      </w:r>
+      <w:proofErr w:type="spellStart"/>
+      <w:r>
+        <w:rPr>
+          <w:rFonts w:ascii="Arial" w:eastAsia="Arial" w:hAnsi="Arial" w:cs="Arial"/>
+          <w:color w:val="000000"/>
+        </w:rPr>
+        <w:t>main</w:t>
+      </w:r>
+      <w:proofErr w:type="spellEnd"/>
+      <w:r>
+        <w:rPr>
+          <w:rFonts w:ascii="Arial" w:eastAsia="Arial" w:hAnsi="Arial" w:cs="Arial"/>
+          <w:color w:val="000000"/>
+        </w:rPr>
+        <w:t xml:space="preserve"> (producción), </w:t>
+      </w:r>
+      <w:proofErr w:type="spellStart"/>
+      <w:r>
+        <w:rPr>
+          <w:rFonts w:ascii="Arial" w:eastAsia="Arial" w:hAnsi="Arial" w:cs="Arial"/>
+          <w:color w:val="000000"/>
+        </w:rPr>
+        <w:t>develop</w:t>
+      </w:r>
+      <w:proofErr w:type="spellEnd"/>
+      <w:r>
+        <w:rPr>
+          <w:rFonts w:ascii="Arial" w:eastAsia="Arial" w:hAnsi="Arial" w:cs="Arial"/>
+          <w:color w:val="000000"/>
+        </w:rPr>
+        <w:t xml:space="preserve"> (integración), </w:t>
+      </w:r>
+      <w:proofErr w:type="spellStart"/>
+      <w:r>
+        <w:rPr>
+          <w:rFonts w:ascii="Arial" w:eastAsia="Arial" w:hAnsi="Arial" w:cs="Arial"/>
+          <w:color w:val="000000"/>
+        </w:rPr>
+        <w:t>feature</w:t>
+      </w:r>
+      <w:proofErr w:type="spellEnd"/>
+      <w:r>
+        <w:rPr>
+          <w:rFonts w:ascii="Arial" w:eastAsia="Arial" w:hAnsi="Arial" w:cs="Arial"/>
+          <w:color w:val="000000"/>
+        </w:rPr>
+        <w:t xml:space="preserve">/* (nuevas funcionalidades), </w:t>
+      </w:r>
+      <w:proofErr w:type="spellStart"/>
+      <w:r>
+        <w:rPr>
+          <w:rFonts w:ascii="Arial" w:eastAsia="Arial" w:hAnsi="Arial" w:cs="Arial"/>
+          <w:color w:val="000000"/>
+        </w:rPr>
+        <w:t>release</w:t>
+      </w:r>
+      <w:proofErr w:type="spellEnd"/>
+      <w:r>
+        <w:rPr>
+          <w:rFonts w:ascii="Arial" w:eastAsia="Arial" w:hAnsi="Arial" w:cs="Arial"/>
+          <w:color w:val="000000"/>
+        </w:rPr>
+        <w:t xml:space="preserve">/* (preparación de versiones) y </w:t>
+      </w:r>
+      <w:proofErr w:type="spellStart"/>
+      <w:r>
+        <w:rPr>
+          <w:rFonts w:ascii="Arial" w:eastAsia="Arial" w:hAnsi="Arial" w:cs="Arial"/>
+          <w:color w:val="000000"/>
+        </w:rPr>
+        <w:t>hotfix</w:t>
+      </w:r>
+      <w:proofErr w:type="spellEnd"/>
+      <w:r>
+        <w:rPr>
+          <w:rFonts w:ascii="Arial" w:eastAsia="Arial" w:hAnsi="Arial" w:cs="Arial"/>
+          <w:color w:val="000000"/>
+        </w:rPr>
+        <w:t>/* (correcciones urgentes). Esta estructura garantiza que el código en producción sea siempre estable y que los cambios sean revisados antes de su integración.</w:t>
+      </w:r>
+    </w:p>
+    <w:p>
+      <w:pPr>
+        <w:spacing w:before="240"/>
         <w:ind w:firstLine="708"/>
         <w:rPr>
           <w:rFonts w:ascii="Arial" w:hAnsi="Arial" w:cs="Arial"/>
@@ -3554,6 +3807,852 @@
         </w:rPr>
         <w:t>iagrama de casos de uso</w:t>
       </w:r>
+    </w:p>
+    <w:p>
+      <w:pPr>
+        <w:widowControl w:val="0"/>
+        <w:pBdr>
+          <w:top w:val="nil"/>
+          <w:left w:val="nil"/>
+          <w:bottom w:val="nil"/>
+          <w:right w:val="nil"/>
+          <w:between w:val="nil"/>
+        </w:pBdr>
+        <w:spacing w:after="0" w:line="360" w:lineRule="auto"/>
+        <w:ind w:firstLine="709"/>
+        <w:jc w:val="both"/>
+        <w:rPr>
+          <w:rFonts w:ascii="Arial" w:eastAsia="Arial" w:hAnsi="Arial" w:cs="Arial"/>
+          <w:color w:val="000000"/>
+        </w:rPr>
+      </w:pPr>
+      <w:r>
+        <w:rPr>
+          <w:rFonts w:ascii="Arial" w:eastAsia="Arial" w:hAnsi="Arial" w:cs="Arial"/>
+          <w:color w:val="000000"/>
+        </w:rPr>
+        <w:t xml:space="preserve">El diagrama de casos de uso representa las interacciones entre los actores del sistema (Usuario Final, Técnico de Soporte, Administrador) y las funcionalidades principales del sistema Help </w:t>
+      </w:r>
+      <w:proofErr w:type="spellStart"/>
+      <w:r>
+        <w:rPr>
+          <w:rFonts w:ascii="Arial" w:eastAsia="Arial" w:hAnsi="Arial" w:cs="Arial"/>
+          <w:color w:val="000000"/>
+        </w:rPr>
+        <w:t>Desk</w:t>
+      </w:r>
+      <w:proofErr w:type="spellEnd"/>
+      <w:r>
+        <w:rPr>
+          <w:rFonts w:ascii="Arial" w:eastAsia="Arial" w:hAnsi="Arial" w:cs="Arial"/>
+          <w:color w:val="000000"/>
+        </w:rPr>
+        <w:t>. Este diagrama ilustra los procesos clave como crear incidentes, asignar tickets, actualizar estados, generar reportes y gestionar usuarios. Los casos de uso permiten comprender visualmente qué funcionalidades disponibles tiene cada actor y cómo interactúan con el sistema.</w:t>
+      </w:r>
+    </w:p>
+    <w:p>
+      <w:pPr>
+        <w:rPr>
+          <w:rFonts w:ascii="Arial" w:hAnsi="Arial" w:cs="Arial"/>
+          <w:b/>
+          <w:bCs/>
+          <w:lang w:eastAsia="es-EC"/>
+        </w:rPr>
+      </w:pPr>
+      <w:r>
+        <w:rPr>
+          <w:rFonts w:ascii="Arial" w:hAnsi="Arial" w:cs="Arial"/>
+          <w:b/>
+          <w:bCs/>
+          <w:noProof/>
+          <w:lang w:eastAsia="es-EC"/>
+        </w:rPr>
+        <w:drawing>
+          <wp:inline distT="0" distB="0" distL="0" distR="0" wp14:anchorId="3E6C46B5" wp14:editId="1E78B0F4">
+            <wp:extent cx="5400040" cy="3599815"/>
+            <wp:effectExtent l="0" t="0" r="0" b="635"/>
+            <wp:docPr id="346395064" name="Imagen 2"/>
+            <wp:cNvGraphicFramePr>
+              <a:graphicFrameLocks xmlns:a="http://schemas.openxmlformats.org/drawingml/2006/main" noChangeAspect="1"/>
+            </wp:cNvGraphicFramePr>
+            <a:graphic xmlns:a="http://schemas.openxmlformats.org/drawingml/2006/main">
+              <a:graphicData uri="http://schemas.openxmlformats.org/drawingml/2006/picture">
+                <pic:pic xmlns:pic="http://schemas.openxmlformats.org/drawingml/2006/picture">
+                  <pic:nvPicPr>
+                    <pic:cNvPr id="346395064" name="Imagen 346395064"/>
+                    <pic:cNvPicPr/>
+                  </pic:nvPicPr>
+                  <pic:blipFill>
+                    <a:blip r:embed="rId16" cstate="print">
+                      <a:extLst>
+                        <a:ext uri="{28A0092B-C50C-407E-A947-70E740481C1C}">
+                          <a14:useLocalDpi xmlns:a14="http://schemas.microsoft.com/office/drawing/2010/main" val="0"/>
+                        </a:ext>
+                      </a:extLst>
+                    </a:blip>
+                    <a:stretch>
+                      <a:fillRect/>
+                    </a:stretch>
+                  </pic:blipFill>
+                  <pic:spPr>
+                    <a:xfrm>
+                      <a:off x="0" y="0"/>
+                      <a:ext cx="5400040" cy="3599815"/>
+                    </a:xfrm>
+                    <a:prstGeom prst="rect">
+                      <a:avLst/>
+                    </a:prstGeom>
+                  </pic:spPr>
+                </pic:pic>
+              </a:graphicData>
+            </a:graphic>
+          </wp:inline>
+        </w:drawing>
+      </w:r>
+    </w:p>
+    <w:p>
+      <w:pPr>
+        <w:ind w:firstLine="708"/>
+        <w:rPr>
+          <w:rFonts w:ascii="Arial" w:hAnsi="Arial" w:cs="Arial"/>
+          <w:b/>
+          <w:bCs/>
+          <w:lang w:eastAsia="es-EC"/>
+        </w:rPr>
+      </w:pPr>
+      <w:r>
+        <w:rPr>
+          <w:rFonts w:ascii="Arial" w:hAnsi="Arial" w:cs="Arial"/>
+          <w:b/>
+          <w:bCs/>
+          <w:lang w:eastAsia="es-EC"/>
+        </w:rPr>
+        <w:t xml:space="preserve">2.4 </w:t>
+      </w:r>
+      <w:r>
+        <w:rPr>
+          <w:rFonts w:ascii="Arial" w:hAnsi="Arial" w:cs="Arial"/>
+          <w:b/>
+          <w:bCs/>
+          <w:lang w:eastAsia="es-EC"/>
+        </w:rPr>
+        <w:t>D</w:t>
+      </w:r>
+      <w:r>
+        <w:rPr>
+          <w:rFonts w:ascii="Arial" w:hAnsi="Arial" w:cs="Arial"/>
+          <w:b/>
+          <w:bCs/>
+          <w:lang w:eastAsia="es-EC"/>
+        </w:rPr>
+        <w:t>iagrama de clases UML</w:t>
+      </w:r>
+    </w:p>
+    <w:p>
+      <w:pPr>
+        <w:widowControl w:val="0"/>
+        <w:pBdr>
+          <w:top w:val="nil"/>
+          <w:left w:val="nil"/>
+          <w:bottom w:val="nil"/>
+          <w:right w:val="nil"/>
+          <w:between w:val="nil"/>
+        </w:pBdr>
+        <w:spacing w:after="0" w:line="360" w:lineRule="auto"/>
+        <w:ind w:firstLine="709"/>
+        <w:jc w:val="both"/>
+        <w:rPr>
+          <w:rFonts w:ascii="Arial" w:eastAsia="Arial" w:hAnsi="Arial" w:cs="Arial"/>
+          <w:color w:val="000000"/>
+        </w:rPr>
+      </w:pPr>
+      <w:r>
+        <w:rPr>
+          <w:rFonts w:ascii="Arial" w:eastAsia="Arial" w:hAnsi="Arial" w:cs="Arial"/>
+          <w:color w:val="000000"/>
+        </w:rPr>
+        <w:t xml:space="preserve">El diagrama de clases UML especifica la estructura orientada a objetos del sistema, definiendo las clases principales, sus atributos, métodos y relaciones. Este diagrama incluye las clases Incidente, Usuario, </w:t>
+      </w:r>
+      <w:proofErr w:type="spellStart"/>
+      <w:r>
+        <w:rPr>
+          <w:rFonts w:ascii="Arial" w:eastAsia="Arial" w:hAnsi="Arial" w:cs="Arial"/>
+          <w:color w:val="000000"/>
+        </w:rPr>
+        <w:t>Tecnico</w:t>
+      </w:r>
+      <w:proofErr w:type="spellEnd"/>
+      <w:r>
+        <w:rPr>
+          <w:rFonts w:ascii="Arial" w:eastAsia="Arial" w:hAnsi="Arial" w:cs="Arial"/>
+          <w:color w:val="000000"/>
+        </w:rPr>
+        <w:t xml:space="preserve">, Administrador, </w:t>
+      </w:r>
+      <w:proofErr w:type="spellStart"/>
+      <w:r>
+        <w:rPr>
+          <w:rFonts w:ascii="Arial" w:eastAsia="Arial" w:hAnsi="Arial" w:cs="Arial"/>
+          <w:color w:val="000000"/>
+        </w:rPr>
+        <w:t>Notificacion</w:t>
+      </w:r>
+      <w:proofErr w:type="spellEnd"/>
+      <w:r>
+        <w:rPr>
+          <w:rFonts w:ascii="Arial" w:eastAsia="Arial" w:hAnsi="Arial" w:cs="Arial"/>
+          <w:color w:val="000000"/>
+        </w:rPr>
+        <w:t xml:space="preserve"> y Reporte, mostrando cómo se relacionan entre sí mediante herencia, composición y asociación. La claridad en la estructura de clases facilita la implementación del código y asegura una arquitectura coherente.</w:t>
+      </w:r>
+    </w:p>
+    <w:p>
+      <w:pPr>
+        <w:rPr>
+          <w:rFonts w:ascii="Arial" w:hAnsi="Arial" w:cs="Arial"/>
+          <w:b/>
+          <w:bCs/>
+          <w:lang w:eastAsia="es-EC"/>
+        </w:rPr>
+      </w:pPr>
+      <w:r>
+        <w:rPr>
+          <w:rFonts w:ascii="Arial" w:hAnsi="Arial" w:cs="Arial"/>
+          <w:b/>
+          <w:bCs/>
+          <w:noProof/>
+          <w:lang w:eastAsia="es-EC"/>
+        </w:rPr>
+        <w:lastRenderedPageBreak/>
+        <w:drawing>
+          <wp:inline distT="0" distB="0" distL="0" distR="0" wp14:anchorId="44BC2E4E" wp14:editId="46EA5D8C">
+            <wp:extent cx="5400040" cy="5998845"/>
+            <wp:effectExtent l="0" t="0" r="0" b="1905"/>
+            <wp:docPr id="1240044407" name="Imagen 3"/>
+            <wp:cNvGraphicFramePr>
+              <a:graphicFrameLocks xmlns:a="http://schemas.openxmlformats.org/drawingml/2006/main" noChangeAspect="1"/>
+            </wp:cNvGraphicFramePr>
+            <a:graphic xmlns:a="http://schemas.openxmlformats.org/drawingml/2006/main">
+              <a:graphicData uri="http://schemas.openxmlformats.org/drawingml/2006/picture">
+                <pic:pic xmlns:pic="http://schemas.openxmlformats.org/drawingml/2006/picture">
+                  <pic:nvPicPr>
+                    <pic:cNvPr id="1240044407" name="Imagen 1240044407"/>
+                    <pic:cNvPicPr/>
+                  </pic:nvPicPr>
+                  <pic:blipFill>
+                    <a:blip r:embed="rId17">
+                      <a:extLst>
+                        <a:ext uri="{28A0092B-C50C-407E-A947-70E740481C1C}">
+                          <a14:useLocalDpi xmlns:a14="http://schemas.microsoft.com/office/drawing/2010/main" val="0"/>
+                        </a:ext>
+                      </a:extLst>
+                    </a:blip>
+                    <a:stretch>
+                      <a:fillRect/>
+                    </a:stretch>
+                  </pic:blipFill>
+                  <pic:spPr>
+                    <a:xfrm>
+                      <a:off x="0" y="0"/>
+                      <a:ext cx="5400040" cy="5998845"/>
+                    </a:xfrm>
+                    <a:prstGeom prst="rect">
+                      <a:avLst/>
+                    </a:prstGeom>
+                  </pic:spPr>
+                </pic:pic>
+              </a:graphicData>
+            </a:graphic>
+          </wp:inline>
+        </w:drawing>
+      </w:r>
+    </w:p>
+    <w:p>
+      <w:pPr>
+        <w:ind w:firstLine="708"/>
+        <w:rPr>
+          <w:rFonts w:ascii="Arial" w:hAnsi="Arial" w:cs="Arial"/>
+          <w:b/>
+          <w:bCs/>
+          <w:lang w:eastAsia="es-EC"/>
+        </w:rPr>
+      </w:pPr>
+      <w:r>
+        <w:rPr>
+          <w:rFonts w:ascii="Arial" w:hAnsi="Arial" w:cs="Arial"/>
+          <w:b/>
+          <w:bCs/>
+          <w:lang w:eastAsia="es-EC"/>
+        </w:rPr>
+        <w:t xml:space="preserve">2.5 </w:t>
+      </w:r>
+      <w:r>
+        <w:rPr>
+          <w:rFonts w:ascii="Arial" w:hAnsi="Arial" w:cs="Arial"/>
+          <w:b/>
+          <w:bCs/>
+          <w:lang w:eastAsia="es-EC"/>
+        </w:rPr>
+        <w:t>A</w:t>
+      </w:r>
+      <w:r>
+        <w:rPr>
+          <w:rFonts w:ascii="Arial" w:hAnsi="Arial" w:cs="Arial"/>
+          <w:b/>
+          <w:bCs/>
+          <w:lang w:eastAsia="es-EC"/>
+        </w:rPr>
+        <w:t>rquitectura general del sistema</w:t>
+      </w:r>
+    </w:p>
+    <w:p>
+      <w:pPr>
+        <w:widowControl w:val="0"/>
+        <w:pBdr>
+          <w:top w:val="nil"/>
+          <w:left w:val="nil"/>
+          <w:bottom w:val="nil"/>
+          <w:right w:val="nil"/>
+          <w:between w:val="nil"/>
+        </w:pBdr>
+        <w:spacing w:after="0" w:line="360" w:lineRule="auto"/>
+        <w:ind w:firstLine="709"/>
+        <w:jc w:val="both"/>
+        <w:rPr>
+          <w:rFonts w:ascii="Arial" w:eastAsia="Arial" w:hAnsi="Arial" w:cs="Arial"/>
+          <w:color w:val="000000"/>
+        </w:rPr>
+      </w:pPr>
+      <w:r>
+        <w:rPr>
+          <w:rFonts w:ascii="Arial" w:eastAsia="Arial" w:hAnsi="Arial" w:cs="Arial"/>
+          <w:color w:val="000000"/>
+        </w:rPr>
+        <w:t>La arquitectura general del sistema sigue un patrón de tres capas: presentación (</w:t>
+      </w:r>
+      <w:proofErr w:type="spellStart"/>
+      <w:r>
+        <w:rPr>
+          <w:rFonts w:ascii="Arial" w:eastAsia="Arial" w:hAnsi="Arial" w:cs="Arial"/>
+          <w:color w:val="000000"/>
+        </w:rPr>
+        <w:t>frontend</w:t>
+      </w:r>
+      <w:proofErr w:type="spellEnd"/>
+      <w:r>
+        <w:rPr>
+          <w:rFonts w:ascii="Arial" w:eastAsia="Arial" w:hAnsi="Arial" w:cs="Arial"/>
+          <w:color w:val="000000"/>
+        </w:rPr>
+        <w:t>), lógica de negocio (</w:t>
+      </w:r>
+      <w:proofErr w:type="spellStart"/>
+      <w:r>
+        <w:rPr>
+          <w:rFonts w:ascii="Arial" w:eastAsia="Arial" w:hAnsi="Arial" w:cs="Arial"/>
+          <w:color w:val="000000"/>
+        </w:rPr>
+        <w:t>backend</w:t>
+      </w:r>
+      <w:proofErr w:type="spellEnd"/>
+      <w:r>
+        <w:rPr>
+          <w:rFonts w:ascii="Arial" w:eastAsia="Arial" w:hAnsi="Arial" w:cs="Arial"/>
+          <w:color w:val="000000"/>
+        </w:rPr>
+        <w:t xml:space="preserve">) y persistencia (base de datos). Esta separación de responsabilidades permite que cada capa sea desarrollada, testeada y mantenida de forma independiente. La capa de presentación proporciona la interfaz de usuario, la capa de lógica implementa las reglas de negocio y la gestión de incidentes, y la capa de datos almacena toda la información del sistema. La comunicación entre capas se realiza mediante </w:t>
+      </w:r>
+      <w:proofErr w:type="spellStart"/>
+      <w:r>
+        <w:rPr>
+          <w:rFonts w:ascii="Arial" w:eastAsia="Arial" w:hAnsi="Arial" w:cs="Arial"/>
+          <w:color w:val="000000"/>
+        </w:rPr>
+        <w:t>APIs</w:t>
+      </w:r>
+      <w:proofErr w:type="spellEnd"/>
+      <w:r>
+        <w:rPr>
+          <w:rFonts w:ascii="Arial" w:eastAsia="Arial" w:hAnsi="Arial" w:cs="Arial"/>
+          <w:color w:val="000000"/>
+        </w:rPr>
+        <w:t xml:space="preserve"> REST, asegurando un acoplamiento débil y una escalabilidad mejorada.</w:t>
+      </w:r>
+    </w:p>
+    <w:p>
+      <w:pPr>
+        <w:jc w:val="center"/>
+        <w:rPr>
+          <w:rFonts w:ascii="Arial" w:hAnsi="Arial" w:cs="Arial"/>
+          <w:b/>
+          <w:bCs/>
+          <w:lang w:eastAsia="es-EC"/>
+        </w:rPr>
+      </w:pPr>
+      <w:r>
+        <w:rPr>
+          <w:rFonts w:ascii="Arial" w:hAnsi="Arial" w:cs="Arial"/>
+          <w:b/>
+          <w:bCs/>
+          <w:noProof/>
+          <w:lang w:eastAsia="es-EC"/>
+        </w:rPr>
+        <w:lastRenderedPageBreak/>
+        <w:drawing>
+          <wp:inline distT="0" distB="0" distL="0" distR="0" wp14:anchorId="35E0E473" wp14:editId="1BA4DB2B">
+            <wp:extent cx="4190365" cy="4595407"/>
+            <wp:effectExtent l="0" t="0" r="635" b="0"/>
+            <wp:docPr id="1742473920" name="Imagen 4"/>
+            <wp:cNvGraphicFramePr>
+              <a:graphicFrameLocks xmlns:a="http://schemas.openxmlformats.org/drawingml/2006/main" noChangeAspect="1"/>
+            </wp:cNvGraphicFramePr>
+            <a:graphic xmlns:a="http://schemas.openxmlformats.org/drawingml/2006/main">
+              <a:graphicData uri="http://schemas.openxmlformats.org/drawingml/2006/picture">
+                <pic:pic xmlns:pic="http://schemas.openxmlformats.org/drawingml/2006/picture">
+                  <pic:nvPicPr>
+                    <pic:cNvPr id="1742473920" name="Imagen 1742473920"/>
+                    <pic:cNvPicPr/>
+                  </pic:nvPicPr>
+                  <pic:blipFill>
+                    <a:blip r:embed="rId18">
+                      <a:extLst>
+                        <a:ext uri="{28A0092B-C50C-407E-A947-70E740481C1C}">
+                          <a14:useLocalDpi xmlns:a14="http://schemas.microsoft.com/office/drawing/2010/main" val="0"/>
+                        </a:ext>
+                      </a:extLst>
+                    </a:blip>
+                    <a:stretch>
+                      <a:fillRect/>
+                    </a:stretch>
+                  </pic:blipFill>
+                  <pic:spPr>
+                    <a:xfrm>
+                      <a:off x="0" y="0"/>
+                      <a:ext cx="4195196" cy="4600705"/>
+                    </a:xfrm>
+                    <a:prstGeom prst="rect">
+                      <a:avLst/>
+                    </a:prstGeom>
+                  </pic:spPr>
+                </pic:pic>
+              </a:graphicData>
+            </a:graphic>
+          </wp:inline>
+        </w:drawing>
+      </w:r>
+    </w:p>
+    <w:p>
+      <w:pPr>
+        <w:spacing w:line="360" w:lineRule="auto"/>
+        <w:rPr>
+          <w:rFonts w:ascii="Arial" w:hAnsi="Arial" w:cs="Arial"/>
+          <w:b/>
+          <w:bCs/>
+          <w:lang w:eastAsia="es-EC"/>
+        </w:rPr>
+      </w:pPr>
+      <w:r>
+        <w:rPr>
+          <w:rFonts w:ascii="Arial" w:hAnsi="Arial" w:cs="Arial"/>
+          <w:b/>
+          <w:bCs/>
+          <w:lang w:eastAsia="es-EC"/>
+        </w:rPr>
+        <w:t xml:space="preserve">3. </w:t>
+      </w:r>
+      <w:r>
+        <w:rPr>
+          <w:rFonts w:ascii="Arial" w:hAnsi="Arial" w:cs="Arial"/>
+          <w:b/>
+          <w:bCs/>
+          <w:lang w:eastAsia="es-EC"/>
+        </w:rPr>
+        <w:t>Aplicación de patrones de diseño</w:t>
+      </w:r>
+    </w:p>
+    <w:p>
+      <w:pPr>
+        <w:spacing w:line="360" w:lineRule="auto"/>
+        <w:ind w:firstLine="708"/>
+        <w:jc w:val="both"/>
+        <w:rPr>
+          <w:rFonts w:ascii="Arial" w:hAnsi="Arial" w:cs="Arial"/>
+          <w:b/>
+          <w:bCs/>
+          <w:lang w:val="es-ES" w:eastAsia="es-EC"/>
+        </w:rPr>
+      </w:pPr>
+      <w:r>
+        <w:rPr>
+          <w:rFonts w:ascii="Arial" w:hAnsi="Arial" w:cs="Arial"/>
+          <w:b/>
+          <w:bCs/>
+          <w:lang w:val="es-ES" w:eastAsia="es-EC"/>
+        </w:rPr>
+        <w:t xml:space="preserve">3.1 </w:t>
+      </w:r>
+      <w:r>
+        <w:rPr>
+          <w:rFonts w:ascii="Arial" w:hAnsi="Arial" w:cs="Arial"/>
+          <w:b/>
+          <w:bCs/>
+          <w:lang w:val="es-ES" w:eastAsia="es-EC"/>
+        </w:rPr>
+        <w:t>Singleton</w:t>
+      </w:r>
+    </w:p>
+    <w:p>
+      <w:pPr>
+        <w:jc w:val="center"/>
+        <w:rPr>
+          <w:rFonts w:ascii="Arial" w:hAnsi="Arial" w:cs="Arial"/>
+          <w:lang w:val="es-ES" w:eastAsia="es-EC"/>
+        </w:rPr>
+      </w:pPr>
+      <w:r>
+        <w:rPr>
+          <w:rFonts w:ascii="Arial" w:hAnsi="Arial" w:cs="Arial"/>
+          <w:lang w:eastAsia="es-EC"/>
+        </w:rPr>
+        <w:t>(REDACTAR UN PARRAFO PEQUEÑO DE QUE</w:t>
+      </w:r>
+      <w:r>
+        <w:rPr>
+          <w:rFonts w:ascii="Arial" w:hAnsi="Arial" w:cs="Arial"/>
+          <w:lang w:eastAsia="es-EC"/>
+        </w:rPr>
+        <w:t xml:space="preserve"> ES USANDO CONECTORES PARA CITAR Y COMO SE APLICARIA EN PROYECTO</w:t>
+      </w:r>
+      <w:r>
+        <w:rPr>
+          <w:rFonts w:ascii="Arial" w:hAnsi="Arial" w:cs="Arial"/>
+          <w:lang w:eastAsia="es-EC"/>
+        </w:rPr>
+        <w:t>)</w:t>
+      </w:r>
+    </w:p>
+    <w:p>
+      <w:pPr>
+        <w:spacing w:line="360" w:lineRule="auto"/>
+        <w:ind w:firstLine="708"/>
+        <w:jc w:val="both"/>
+        <w:rPr>
+          <w:rFonts w:ascii="Arial" w:hAnsi="Arial" w:cs="Arial"/>
+          <w:b/>
+          <w:bCs/>
+          <w:lang w:val="es-ES" w:eastAsia="es-EC"/>
+        </w:rPr>
+      </w:pPr>
+      <w:r>
+        <w:rPr>
+          <w:rFonts w:ascii="Arial" w:hAnsi="Arial" w:cs="Arial"/>
+          <w:b/>
+          <w:bCs/>
+          <w:lang w:val="es-ES" w:eastAsia="es-EC"/>
+        </w:rPr>
+        <w:t xml:space="preserve">3.2 </w:t>
+      </w:r>
+      <w:proofErr w:type="spellStart"/>
+      <w:r>
+        <w:rPr>
+          <w:rFonts w:ascii="Arial" w:hAnsi="Arial" w:cs="Arial"/>
+          <w:b/>
+          <w:bCs/>
+          <w:lang w:val="es-ES" w:eastAsia="es-EC"/>
+        </w:rPr>
+        <w:t>Observer</w:t>
+      </w:r>
+      <w:proofErr w:type="spellEnd"/>
+      <w:r>
+        <w:rPr>
+          <w:rFonts w:ascii="Arial" w:hAnsi="Arial" w:cs="Arial"/>
+          <w:b/>
+          <w:bCs/>
+          <w:lang w:val="es-ES" w:eastAsia="es-EC"/>
+        </w:rPr>
+        <w:t xml:space="preserve"> (Publicador-Suscriptor)</w:t>
+      </w:r>
+    </w:p>
+    <w:p>
+      <w:pPr>
+        <w:jc w:val="center"/>
+        <w:rPr>
+          <w:rFonts w:ascii="Arial" w:hAnsi="Arial" w:cs="Arial"/>
+          <w:lang w:val="es-ES" w:eastAsia="es-EC"/>
+        </w:rPr>
+      </w:pPr>
+      <w:r>
+        <w:rPr>
+          <w:rFonts w:ascii="Arial" w:hAnsi="Arial" w:cs="Arial"/>
+          <w:lang w:eastAsia="es-EC"/>
+        </w:rPr>
+        <w:t>(REDACTAR UN PARRAFO PEQUEÑO DE QUE ES USANDO CONECTORES PARA CITAR Y COMO SE APLICARIA EN PROYECTO)</w:t>
+      </w:r>
+    </w:p>
+    <w:p>
+      <w:pPr>
+        <w:spacing w:line="360" w:lineRule="auto"/>
+        <w:jc w:val="both"/>
+        <w:rPr>
+          <w:rFonts w:ascii="Arial" w:hAnsi="Arial" w:cs="Arial"/>
+          <w:b/>
+          <w:bCs/>
+          <w:lang w:val="es-ES" w:eastAsia="es-EC"/>
+        </w:rPr>
+      </w:pPr>
+    </w:p>
+    <w:p>
+      <w:pPr>
+        <w:spacing w:line="360" w:lineRule="auto"/>
+        <w:ind w:firstLine="708"/>
+        <w:jc w:val="both"/>
+        <w:rPr>
+          <w:rFonts w:ascii="Arial" w:hAnsi="Arial" w:cs="Arial"/>
+          <w:b/>
+          <w:bCs/>
+          <w:lang w:val="es-ES" w:eastAsia="es-EC"/>
+        </w:rPr>
+      </w:pPr>
+      <w:r>
+        <w:rPr>
+          <w:rFonts w:ascii="Arial" w:hAnsi="Arial" w:cs="Arial"/>
+          <w:b/>
+          <w:bCs/>
+          <w:lang w:val="es-ES" w:eastAsia="es-EC"/>
+        </w:rPr>
+        <w:t xml:space="preserve">3.3 </w:t>
+      </w:r>
+      <w:r>
+        <w:rPr>
+          <w:rFonts w:ascii="Arial" w:hAnsi="Arial" w:cs="Arial"/>
+          <w:b/>
+          <w:bCs/>
+          <w:lang w:val="es-ES" w:eastAsia="es-EC"/>
+        </w:rPr>
+        <w:t>Factory Method</w:t>
+      </w:r>
+    </w:p>
+    <w:p>
+      <w:pPr>
+        <w:jc w:val="center"/>
+        <w:rPr>
+          <w:rFonts w:ascii="Arial" w:hAnsi="Arial" w:cs="Arial"/>
+          <w:lang w:val="es-ES" w:eastAsia="es-EC"/>
+        </w:rPr>
+      </w:pPr>
+      <w:r>
+        <w:rPr>
+          <w:rFonts w:ascii="Arial" w:hAnsi="Arial" w:cs="Arial"/>
+          <w:lang w:eastAsia="es-EC"/>
+        </w:rPr>
+        <w:t>(REDACTAR UN PARRAFO PEQUEÑO DE QUE ES USANDO CONECTORES PARA CITAR Y COMO SE APLICARIA EN PROYECTO)</w:t>
+      </w:r>
+    </w:p>
+    <w:p>
+      <w:pPr>
+        <w:spacing w:line="360" w:lineRule="auto"/>
+        <w:jc w:val="center"/>
+        <w:rPr>
+          <w:rFonts w:ascii="Arial" w:hAnsi="Arial" w:cs="Arial"/>
+          <w:lang w:val="es-ES" w:eastAsia="es-EC"/>
+        </w:rPr>
+      </w:pPr>
+    </w:p>
+    <w:p>
+      <w:pPr>
+        <w:spacing w:line="360" w:lineRule="auto"/>
+        <w:ind w:firstLine="708"/>
+        <w:jc w:val="both"/>
+        <w:rPr>
+          <w:rFonts w:ascii="Arial" w:hAnsi="Arial" w:cs="Arial"/>
+          <w:b/>
+          <w:bCs/>
+          <w:lang w:val="es-ES" w:eastAsia="es-EC"/>
+        </w:rPr>
+      </w:pPr>
+      <w:r>
+        <w:rPr>
+          <w:rFonts w:ascii="Arial" w:hAnsi="Arial" w:cs="Arial"/>
+          <w:b/>
+          <w:bCs/>
+          <w:lang w:val="es-ES" w:eastAsia="es-EC"/>
+        </w:rPr>
+        <w:t xml:space="preserve">3.4 </w:t>
+      </w:r>
+      <w:r>
+        <w:rPr>
+          <w:rFonts w:ascii="Arial" w:hAnsi="Arial" w:cs="Arial"/>
+          <w:b/>
+          <w:bCs/>
+          <w:lang w:val="es-ES" w:eastAsia="es-EC"/>
+        </w:rPr>
+        <w:t>MVC (Model-View-</w:t>
+      </w:r>
+      <w:proofErr w:type="spellStart"/>
+      <w:r>
+        <w:rPr>
+          <w:rFonts w:ascii="Arial" w:hAnsi="Arial" w:cs="Arial"/>
+          <w:b/>
+          <w:bCs/>
+          <w:lang w:val="es-ES" w:eastAsia="es-EC"/>
+        </w:rPr>
+        <w:t>Controller</w:t>
+      </w:r>
+      <w:proofErr w:type="spellEnd"/>
+      <w:r>
+        <w:rPr>
+          <w:rFonts w:ascii="Arial" w:hAnsi="Arial" w:cs="Arial"/>
+          <w:b/>
+          <w:bCs/>
+          <w:lang w:val="es-ES" w:eastAsia="es-EC"/>
+        </w:rPr>
+        <w:t>)</w:t>
+      </w:r>
+    </w:p>
+    <w:p>
+      <w:pPr>
+        <w:jc w:val="center"/>
+        <w:rPr>
+          <w:rFonts w:ascii="Arial" w:hAnsi="Arial" w:cs="Arial"/>
+          <w:lang w:val="es-ES" w:eastAsia="es-EC"/>
+        </w:rPr>
+      </w:pPr>
+      <w:r>
+        <w:rPr>
+          <w:rFonts w:ascii="Arial" w:hAnsi="Arial" w:cs="Arial"/>
+          <w:lang w:eastAsia="es-EC"/>
+        </w:rPr>
+        <w:lastRenderedPageBreak/>
+        <w:t>(REDACTAR UN PARRAFO PEQUEÑO DE QUE ES USANDO CONECTORES PARA CITAR Y COMO SE APLICARIA EN PROYECTO)</w:t>
+      </w:r>
+    </w:p>
+    <w:p>
+      <w:pPr>
+        <w:rPr>
+          <w:rFonts w:ascii="Arial" w:hAnsi="Arial" w:cs="Arial"/>
+          <w:b/>
+          <w:bCs/>
+          <w:lang w:eastAsia="es-EC"/>
+        </w:rPr>
+      </w:pPr>
+    </w:p>
+    <w:p>
+      <w:pPr>
+        <w:rPr>
+          <w:rFonts w:ascii="Arial" w:hAnsi="Arial" w:cs="Arial"/>
+          <w:b/>
+          <w:bCs/>
+          <w:lang w:eastAsia="es-EC"/>
+        </w:rPr>
+      </w:pPr>
+      <w:r>
+        <w:rPr>
+          <w:rFonts w:ascii="Arial" w:hAnsi="Arial" w:cs="Arial"/>
+          <w:b/>
+          <w:bCs/>
+          <w:lang w:eastAsia="es-EC"/>
+        </w:rPr>
+        <w:t xml:space="preserve">4.  </w:t>
+      </w:r>
+      <w:r>
+        <w:rPr>
+          <w:rFonts w:ascii="Arial" w:hAnsi="Arial" w:cs="Arial"/>
+          <w:b/>
+          <w:bCs/>
+          <w:lang w:eastAsia="es-EC"/>
+        </w:rPr>
+        <w:t xml:space="preserve">Justificación del Uso de </w:t>
+      </w:r>
+      <w:proofErr w:type="spellStart"/>
+      <w:r>
+        <w:rPr>
+          <w:rFonts w:ascii="Arial" w:hAnsi="Arial" w:cs="Arial"/>
+          <w:b/>
+          <w:bCs/>
+          <w:lang w:eastAsia="es-EC"/>
+        </w:rPr>
+        <w:t>Gitflow</w:t>
+      </w:r>
+      <w:proofErr w:type="spellEnd"/>
+    </w:p>
+    <w:p>
+      <w:pPr>
+        <w:spacing w:line="360" w:lineRule="auto"/>
+        <w:jc w:val="both"/>
+        <w:rPr>
+          <w:rFonts w:ascii="Arial" w:hAnsi="Arial" w:cs="Arial"/>
+          <w:lang w:eastAsia="es-EC"/>
+        </w:rPr>
+      </w:pPr>
+      <w:r>
+        <w:rPr>
+          <w:rFonts w:ascii="Arial" w:hAnsi="Arial" w:cs="Arial"/>
+          <w:lang w:eastAsia="es-EC"/>
+        </w:rPr>
+        <w:t>(REDACTAR DE MANERA PERONAL POR QUE ES IMPORTANTE)</w:t>
+      </w:r>
+    </w:p>
+    <w:p>
+      <w:pPr>
+        <w:spacing w:line="360" w:lineRule="auto"/>
+        <w:jc w:val="both"/>
+        <w:rPr>
+          <w:rFonts w:ascii="Arial" w:hAnsi="Arial" w:cs="Arial"/>
+          <w:lang w:eastAsia="es-EC"/>
+        </w:rPr>
+      </w:pPr>
+    </w:p>
+    <w:p>
+      <w:pPr>
+        <w:pStyle w:val="Sinespaciado"/>
+        <w:jc w:val="both"/>
+        <w:rPr>
+          <w:rFonts w:ascii="Arial" w:hAnsi="Arial" w:cs="Arial"/>
+          <w:b/>
+          <w:bCs/>
+          <w:lang w:eastAsia="es-EC"/>
+        </w:rPr>
+      </w:pPr>
+      <w:r>
+        <w:rPr>
+          <w:rFonts w:ascii="Arial" w:hAnsi="Arial" w:cs="Arial"/>
+          <w:b/>
+          <w:bCs/>
+          <w:lang w:eastAsia="es-EC"/>
+        </w:rPr>
+        <w:t xml:space="preserve">5. </w:t>
+      </w:r>
+      <w:r>
+        <w:rPr>
+          <w:rFonts w:ascii="Arial" w:hAnsi="Arial" w:cs="Arial"/>
+          <w:b/>
+          <w:bCs/>
+          <w:lang w:eastAsia="es-EC"/>
+        </w:rPr>
+        <w:t>Evidencias</w:t>
+      </w:r>
+    </w:p>
+    <w:p>
+      <w:pPr>
+        <w:widowControl w:val="0"/>
+        <w:pBdr>
+          <w:top w:val="nil"/>
+          <w:left w:val="nil"/>
+          <w:bottom w:val="nil"/>
+          <w:right w:val="nil"/>
+          <w:between w:val="nil"/>
+        </w:pBdr>
+        <w:spacing w:after="0" w:line="240" w:lineRule="auto"/>
+        <w:jc w:val="center"/>
+        <w:rPr>
+          <w:rFonts w:ascii="Arial" w:hAnsi="Arial" w:cs="Arial"/>
+          <w:b/>
+          <w:bCs/>
+          <w:sz w:val="24"/>
+          <w:szCs w:val="24"/>
+          <w:lang w:eastAsia="es-EC"/>
+        </w:rPr>
+      </w:pPr>
     </w:p>
     <w:p>
       <w:pPr>
@@ -3585,79 +4684,9 @@
           <w:sz w:val="20"/>
           <w:szCs w:val="20"/>
         </w:rPr>
-        <w:t>(ESPACIO PARA IMAGEN Y UNA PEQUEÑA DESCRIPCION)</w:t>
-      </w:r>
-    </w:p>
-    <w:p>
-      <w:pPr>
-        <w:rPr>
-          <w:rFonts w:ascii="Arial" w:hAnsi="Arial" w:cs="Arial"/>
-          <w:b/>
-          <w:bCs/>
-          <w:lang w:eastAsia="es-EC"/>
-        </w:rPr>
-      </w:pPr>
-    </w:p>
-    <w:p>
-      <w:pPr>
-        <w:rPr>
-          <w:rFonts w:ascii="Arial" w:hAnsi="Arial" w:cs="Arial"/>
-          <w:b/>
-          <w:bCs/>
-          <w:lang w:eastAsia="es-EC"/>
-        </w:rPr>
-      </w:pPr>
-    </w:p>
-    <w:p>
-      <w:pPr>
-        <w:ind w:firstLine="708"/>
-        <w:rPr>
-          <w:rFonts w:ascii="Arial" w:hAnsi="Arial" w:cs="Arial"/>
-          <w:b/>
-          <w:bCs/>
-          <w:lang w:eastAsia="es-EC"/>
-        </w:rPr>
-      </w:pPr>
-      <w:r>
-        <w:rPr>
-          <w:rFonts w:ascii="Arial" w:hAnsi="Arial" w:cs="Arial"/>
-          <w:b/>
-          <w:bCs/>
-          <w:lang w:eastAsia="es-EC"/>
-        </w:rPr>
-        <w:t xml:space="preserve">2.4 </w:t>
-      </w:r>
-      <w:r>
-        <w:rPr>
-          <w:rFonts w:ascii="Arial" w:hAnsi="Arial" w:cs="Arial"/>
-          <w:b/>
-          <w:bCs/>
-          <w:lang w:eastAsia="es-EC"/>
-        </w:rPr>
-        <w:t>D</w:t>
-      </w:r>
-      <w:r>
-        <w:rPr>
-          <w:rFonts w:ascii="Arial" w:hAnsi="Arial" w:cs="Arial"/>
-          <w:b/>
-          <w:bCs/>
-          <w:lang w:eastAsia="es-EC"/>
-        </w:rPr>
-        <w:t>iagrama de clases UML</w:t>
-      </w:r>
-    </w:p>
-    <w:p>
-      <w:pPr>
-        <w:widowControl w:val="0"/>
-        <w:pBdr>
-          <w:top w:val="nil"/>
-          <w:left w:val="nil"/>
-          <w:bottom w:val="nil"/>
-          <w:right w:val="nil"/>
-          <w:between w:val="nil"/>
-        </w:pBdr>
-        <w:spacing w:after="0" w:line="240" w:lineRule="auto"/>
-        <w:jc w:val="both"/>
+        <w:t>(ESPACIO PARA IMAGEN</w:t>
+      </w:r>
+      <w:r>
         <w:rPr>
           <w:rFonts w:ascii="Arial" w:eastAsia="Arial" w:hAnsi="Arial" w:cs="Arial"/>
           <w:i/>
@@ -3666,7 +4695,8 @@
           <w:sz w:val="20"/>
           <w:szCs w:val="20"/>
         </w:rPr>
-      </w:pPr>
+        <w:t>ES</w:t>
+      </w:r>
       <w:r>
         <w:rPr>
           <w:rFonts w:ascii="Arial" w:eastAsia="Arial" w:hAnsi="Arial" w:cs="Arial"/>
@@ -3676,499 +4706,7 @@
           <w:sz w:val="20"/>
           <w:szCs w:val="20"/>
         </w:rPr>
-        <w:t>(ESPACIO PARA IMAGEN Y UNA PEQUEÑA DESCRIPCION)</w:t>
-      </w:r>
-    </w:p>
-    <w:p>
-      <w:pPr>
-        <w:rPr>
-          <w:rFonts w:ascii="Arial" w:hAnsi="Arial" w:cs="Arial"/>
-          <w:b/>
-          <w:bCs/>
-          <w:lang w:eastAsia="es-EC"/>
-        </w:rPr>
-      </w:pPr>
-    </w:p>
-    <w:p>
-      <w:pPr>
-        <w:rPr>
-          <w:rFonts w:ascii="Arial" w:hAnsi="Arial" w:cs="Arial"/>
-          <w:b/>
-          <w:bCs/>
-          <w:lang w:eastAsia="es-EC"/>
-        </w:rPr>
-      </w:pPr>
-    </w:p>
-    <w:p>
-      <w:pPr>
-        <w:ind w:firstLine="708"/>
-        <w:rPr>
-          <w:rFonts w:ascii="Arial" w:hAnsi="Arial" w:cs="Arial"/>
-          <w:b/>
-          <w:bCs/>
-          <w:lang w:eastAsia="es-EC"/>
-        </w:rPr>
-      </w:pPr>
-      <w:r>
-        <w:rPr>
-          <w:rFonts w:ascii="Arial" w:hAnsi="Arial" w:cs="Arial"/>
-          <w:b/>
-          <w:bCs/>
-          <w:lang w:eastAsia="es-EC"/>
-        </w:rPr>
-        <w:t xml:space="preserve">2.5 </w:t>
-      </w:r>
-      <w:r>
-        <w:rPr>
-          <w:rFonts w:ascii="Arial" w:hAnsi="Arial" w:cs="Arial"/>
-          <w:b/>
-          <w:bCs/>
-          <w:lang w:eastAsia="es-EC"/>
-        </w:rPr>
-        <w:t>A</w:t>
-      </w:r>
-      <w:r>
-        <w:rPr>
-          <w:rFonts w:ascii="Arial" w:hAnsi="Arial" w:cs="Arial"/>
-          <w:b/>
-          <w:bCs/>
-          <w:lang w:eastAsia="es-EC"/>
-        </w:rPr>
-        <w:t>rquitectura general del sistema</w:t>
-      </w:r>
-    </w:p>
-    <w:p>
-      <w:pPr>
-        <w:widowControl w:val="0"/>
-        <w:pBdr>
-          <w:top w:val="nil"/>
-          <w:left w:val="nil"/>
-          <w:bottom w:val="nil"/>
-          <w:right w:val="nil"/>
-          <w:between w:val="nil"/>
-        </w:pBdr>
-        <w:spacing w:after="0" w:line="240" w:lineRule="auto"/>
-        <w:jc w:val="both"/>
-        <w:rPr>
-          <w:rFonts w:ascii="Arial" w:eastAsia="Arial" w:hAnsi="Arial" w:cs="Arial"/>
-          <w:i/>
-          <w:iCs/>
-          <w:color w:val="000000"/>
-          <w:sz w:val="20"/>
-          <w:szCs w:val="20"/>
-        </w:rPr>
-      </w:pPr>
-      <w:r>
-        <w:rPr>
-          <w:rFonts w:ascii="Arial" w:eastAsia="Arial" w:hAnsi="Arial" w:cs="Arial"/>
-          <w:i/>
-          <w:iCs/>
-          <w:color w:val="000000"/>
-          <w:sz w:val="20"/>
-          <w:szCs w:val="20"/>
-        </w:rPr>
-        <w:t>(ESPACIO PARA IMAGEN Y UNA PEQUEÑA DESCRIPCION)</w:t>
-      </w:r>
-    </w:p>
-    <w:p>
-      <w:pPr>
-        <w:jc w:val="center"/>
-        <w:rPr>
-          <w:rFonts w:ascii="Arial" w:hAnsi="Arial" w:cs="Arial"/>
-          <w:b/>
-          <w:bCs/>
-          <w:lang w:eastAsia="es-EC"/>
-        </w:rPr>
-      </w:pPr>
-    </w:p>
-    <w:p>
-      <w:pPr>
-        <w:spacing w:line="360" w:lineRule="auto"/>
-        <w:rPr>
-          <w:rFonts w:ascii="Arial" w:hAnsi="Arial" w:cs="Arial"/>
-          <w:b/>
-          <w:bCs/>
-          <w:lang w:eastAsia="es-EC"/>
-        </w:rPr>
-      </w:pPr>
-      <w:r>
-        <w:rPr>
-          <w:rFonts w:ascii="Arial" w:hAnsi="Arial" w:cs="Arial"/>
-          <w:b/>
-          <w:bCs/>
-          <w:lang w:eastAsia="es-EC"/>
-        </w:rPr>
-        <w:t xml:space="preserve">3. </w:t>
-      </w:r>
-      <w:r>
-        <w:rPr>
-          <w:rFonts w:ascii="Arial" w:hAnsi="Arial" w:cs="Arial"/>
-          <w:b/>
-          <w:bCs/>
-          <w:lang w:eastAsia="es-EC"/>
-        </w:rPr>
-        <w:t>Aplicación de patrones de diseño</w:t>
-      </w:r>
-    </w:p>
-    <w:p>
-      <w:pPr>
-        <w:spacing w:line="360" w:lineRule="auto"/>
-        <w:ind w:firstLine="708"/>
-        <w:jc w:val="both"/>
-        <w:rPr>
-          <w:rFonts w:ascii="Arial" w:hAnsi="Arial" w:cs="Arial"/>
-          <w:b/>
-          <w:bCs/>
-          <w:lang w:val="es-ES" w:eastAsia="es-EC"/>
-        </w:rPr>
-      </w:pPr>
-      <w:r>
-        <w:rPr>
-          <w:rFonts w:ascii="Arial" w:hAnsi="Arial" w:cs="Arial"/>
-          <w:b/>
-          <w:bCs/>
-          <w:lang w:val="es-ES" w:eastAsia="es-EC"/>
-        </w:rPr>
-        <w:t xml:space="preserve">3.1 </w:t>
-      </w:r>
-      <w:r>
-        <w:rPr>
-          <w:rFonts w:ascii="Arial" w:hAnsi="Arial" w:cs="Arial"/>
-          <w:b/>
-          <w:bCs/>
-          <w:lang w:val="es-ES" w:eastAsia="es-EC"/>
-        </w:rPr>
-        <w:t>Singleton</w:t>
-      </w:r>
-    </w:p>
-    <w:p>
-      <w:pPr>
-        <w:jc w:val="center"/>
-        <w:rPr>
-          <w:rFonts w:ascii="Arial" w:hAnsi="Arial" w:cs="Arial"/>
-          <w:lang w:val="es-ES" w:eastAsia="es-EC"/>
-        </w:rPr>
-      </w:pPr>
-      <w:r>
-        <w:rPr>
-          <w:rFonts w:ascii="Arial" w:hAnsi="Arial" w:cs="Arial"/>
-          <w:lang w:eastAsia="es-EC"/>
-        </w:rPr>
-        <w:t>(REDACTAR UN PARRAFO PEQUEÑO DE QUE</w:t>
-      </w:r>
-      <w:r>
-        <w:rPr>
-          <w:rFonts w:ascii="Arial" w:hAnsi="Arial" w:cs="Arial"/>
-          <w:lang w:eastAsia="es-EC"/>
-        </w:rPr>
-        <w:t xml:space="preserve"> ES USANDO CONECTORES PARA CITAR Y COMO SE APLICARIA EN PROYECTO</w:t>
-      </w:r>
-      <w:r>
-        <w:rPr>
-          <w:rFonts w:ascii="Arial" w:hAnsi="Arial" w:cs="Arial"/>
-          <w:lang w:eastAsia="es-EC"/>
-        </w:rPr>
-        <w:t>)</w:t>
-      </w:r>
-    </w:p>
-    <w:p>
-      <w:pPr>
-        <w:spacing w:line="360" w:lineRule="auto"/>
-        <w:ind w:firstLine="708"/>
-        <w:jc w:val="both"/>
-        <w:rPr>
-          <w:rFonts w:ascii="Arial" w:hAnsi="Arial" w:cs="Arial"/>
-          <w:b/>
-          <w:bCs/>
-          <w:lang w:val="es-ES" w:eastAsia="es-EC"/>
-        </w:rPr>
-      </w:pPr>
-      <w:r>
-        <w:rPr>
-          <w:rFonts w:ascii="Arial" w:hAnsi="Arial" w:cs="Arial"/>
-          <w:b/>
-          <w:bCs/>
-          <w:lang w:val="es-ES" w:eastAsia="es-EC"/>
-        </w:rPr>
-        <w:t xml:space="preserve">3.2 </w:t>
-      </w:r>
-      <w:proofErr w:type="spellStart"/>
-      <w:r>
-        <w:rPr>
-          <w:rFonts w:ascii="Arial" w:hAnsi="Arial" w:cs="Arial"/>
-          <w:b/>
-          <w:bCs/>
-          <w:lang w:val="es-ES" w:eastAsia="es-EC"/>
-        </w:rPr>
-        <w:t>Observer</w:t>
-      </w:r>
-      <w:proofErr w:type="spellEnd"/>
-      <w:r>
-        <w:rPr>
-          <w:rFonts w:ascii="Arial" w:hAnsi="Arial" w:cs="Arial"/>
-          <w:b/>
-          <w:bCs/>
-          <w:lang w:val="es-ES" w:eastAsia="es-EC"/>
-        </w:rPr>
-        <w:t xml:space="preserve"> (Publicador-Suscriptor)</w:t>
-      </w:r>
-    </w:p>
-    <w:p>
-      <w:pPr>
-        <w:jc w:val="center"/>
-        <w:rPr>
-          <w:rFonts w:ascii="Arial" w:hAnsi="Arial" w:cs="Arial"/>
-          <w:lang w:val="es-ES" w:eastAsia="es-EC"/>
-        </w:rPr>
-      </w:pPr>
-      <w:r>
-        <w:rPr>
-          <w:rFonts w:ascii="Arial" w:hAnsi="Arial" w:cs="Arial"/>
-          <w:lang w:eastAsia="es-EC"/>
-        </w:rPr>
-        <w:t>(REDACTAR UN PARRAFO PEQUEÑO DE QUE ES USANDO CONECTORES PARA CITAR Y COMO SE APLICARIA EN PROYECTO)</w:t>
-      </w:r>
-    </w:p>
-    <w:p>
-      <w:pPr>
-        <w:spacing w:line="360" w:lineRule="auto"/>
-        <w:jc w:val="both"/>
-        <w:rPr>
-          <w:rFonts w:ascii="Arial" w:hAnsi="Arial" w:cs="Arial"/>
-          <w:b/>
-          <w:bCs/>
-          <w:lang w:val="es-ES" w:eastAsia="es-EC"/>
-        </w:rPr>
-      </w:pPr>
-    </w:p>
-    <w:p>
-      <w:pPr>
-        <w:spacing w:line="360" w:lineRule="auto"/>
-        <w:ind w:firstLine="708"/>
-        <w:jc w:val="both"/>
-        <w:rPr>
-          <w:rFonts w:ascii="Arial" w:hAnsi="Arial" w:cs="Arial"/>
-          <w:b/>
-          <w:bCs/>
-          <w:lang w:val="es-ES" w:eastAsia="es-EC"/>
-        </w:rPr>
-      </w:pPr>
-      <w:r>
-        <w:rPr>
-          <w:rFonts w:ascii="Arial" w:hAnsi="Arial" w:cs="Arial"/>
-          <w:b/>
-          <w:bCs/>
-          <w:lang w:val="es-ES" w:eastAsia="es-EC"/>
-        </w:rPr>
-        <w:t xml:space="preserve">3.3 </w:t>
-      </w:r>
-      <w:r>
-        <w:rPr>
-          <w:rFonts w:ascii="Arial" w:hAnsi="Arial" w:cs="Arial"/>
-          <w:b/>
-          <w:bCs/>
-          <w:lang w:val="es-ES" w:eastAsia="es-EC"/>
-        </w:rPr>
-        <w:t>Factory Method</w:t>
-      </w:r>
-    </w:p>
-    <w:p>
-      <w:pPr>
-        <w:jc w:val="center"/>
-        <w:rPr>
-          <w:rFonts w:ascii="Arial" w:hAnsi="Arial" w:cs="Arial"/>
-          <w:lang w:val="es-ES" w:eastAsia="es-EC"/>
-        </w:rPr>
-      </w:pPr>
-      <w:r>
-        <w:rPr>
-          <w:rFonts w:ascii="Arial" w:hAnsi="Arial" w:cs="Arial"/>
-          <w:lang w:eastAsia="es-EC"/>
-        </w:rPr>
-        <w:t>(REDACTAR UN PARRAFO PEQUEÑO DE QUE ES USANDO CONECTORES PARA CITAR Y COMO SE APLICARIA EN PROYECTO)</w:t>
-      </w:r>
-    </w:p>
-    <w:p>
-      <w:pPr>
-        <w:spacing w:line="360" w:lineRule="auto"/>
-        <w:jc w:val="center"/>
-        <w:rPr>
-          <w:rFonts w:ascii="Arial" w:hAnsi="Arial" w:cs="Arial"/>
-          <w:lang w:val="es-ES" w:eastAsia="es-EC"/>
-        </w:rPr>
-      </w:pPr>
-    </w:p>
-    <w:p>
-      <w:pPr>
-        <w:spacing w:line="360" w:lineRule="auto"/>
-        <w:ind w:firstLine="708"/>
-        <w:jc w:val="both"/>
-        <w:rPr>
-          <w:rFonts w:ascii="Arial" w:hAnsi="Arial" w:cs="Arial"/>
-          <w:b/>
-          <w:bCs/>
-          <w:lang w:val="es-ES" w:eastAsia="es-EC"/>
-        </w:rPr>
-      </w:pPr>
-      <w:r>
-        <w:rPr>
-          <w:rFonts w:ascii="Arial" w:hAnsi="Arial" w:cs="Arial"/>
-          <w:b/>
-          <w:bCs/>
-          <w:lang w:val="es-ES" w:eastAsia="es-EC"/>
-        </w:rPr>
-        <w:t xml:space="preserve">3.4 </w:t>
-      </w:r>
-      <w:r>
-        <w:rPr>
-          <w:rFonts w:ascii="Arial" w:hAnsi="Arial" w:cs="Arial"/>
-          <w:b/>
-          <w:bCs/>
-          <w:lang w:val="es-ES" w:eastAsia="es-EC"/>
-        </w:rPr>
-        <w:t>MVC (Model-View-</w:t>
-      </w:r>
-      <w:proofErr w:type="spellStart"/>
-      <w:r>
-        <w:rPr>
-          <w:rFonts w:ascii="Arial" w:hAnsi="Arial" w:cs="Arial"/>
-          <w:b/>
-          <w:bCs/>
-          <w:lang w:val="es-ES" w:eastAsia="es-EC"/>
-        </w:rPr>
-        <w:t>Controller</w:t>
-      </w:r>
-      <w:proofErr w:type="spellEnd"/>
-      <w:r>
-        <w:rPr>
-          <w:rFonts w:ascii="Arial" w:hAnsi="Arial" w:cs="Arial"/>
-          <w:b/>
-          <w:bCs/>
-          <w:lang w:val="es-ES" w:eastAsia="es-EC"/>
-        </w:rPr>
-        <w:t>)</w:t>
-      </w:r>
-    </w:p>
-    <w:p>
-      <w:pPr>
-        <w:jc w:val="center"/>
-        <w:rPr>
-          <w:rFonts w:ascii="Arial" w:hAnsi="Arial" w:cs="Arial"/>
-          <w:lang w:val="es-ES" w:eastAsia="es-EC"/>
-        </w:rPr>
-      </w:pPr>
-      <w:r>
-        <w:rPr>
-          <w:rFonts w:ascii="Arial" w:hAnsi="Arial" w:cs="Arial"/>
-          <w:lang w:eastAsia="es-EC"/>
-        </w:rPr>
-        <w:t>(REDACTAR UN PARRAFO PEQUEÑO DE QUE ES USANDO CONECTORES PARA CITAR Y COMO SE APLICARIA EN PROYECTO)</w:t>
-      </w:r>
-    </w:p>
-    <w:p>
-      <w:pPr>
-        <w:rPr>
-          <w:rFonts w:ascii="Arial" w:hAnsi="Arial" w:cs="Arial"/>
-          <w:b/>
-          <w:bCs/>
-          <w:lang w:eastAsia="es-EC"/>
-        </w:rPr>
-      </w:pPr>
-    </w:p>
-    <w:p>
-      <w:pPr>
-        <w:rPr>
-          <w:rFonts w:ascii="Arial" w:hAnsi="Arial" w:cs="Arial"/>
-          <w:b/>
-          <w:bCs/>
-          <w:lang w:eastAsia="es-EC"/>
-        </w:rPr>
-      </w:pPr>
-      <w:r>
-        <w:rPr>
-          <w:rFonts w:ascii="Arial" w:hAnsi="Arial" w:cs="Arial"/>
-          <w:b/>
-          <w:bCs/>
-          <w:lang w:eastAsia="es-EC"/>
-        </w:rPr>
-        <w:t xml:space="preserve">4.  </w:t>
-      </w:r>
-      <w:r>
-        <w:rPr>
-          <w:rFonts w:ascii="Arial" w:hAnsi="Arial" w:cs="Arial"/>
-          <w:b/>
-          <w:bCs/>
-          <w:lang w:eastAsia="es-EC"/>
-        </w:rPr>
-        <w:t xml:space="preserve">Justificación del Uso de </w:t>
-      </w:r>
-      <w:proofErr w:type="spellStart"/>
-      <w:r>
-        <w:rPr>
-          <w:rFonts w:ascii="Arial" w:hAnsi="Arial" w:cs="Arial"/>
-          <w:b/>
-          <w:bCs/>
-          <w:lang w:eastAsia="es-EC"/>
-        </w:rPr>
-        <w:t>Gitflow</w:t>
-      </w:r>
-      <w:proofErr w:type="spellEnd"/>
-    </w:p>
-    <w:p>
-      <w:pPr>
-        <w:spacing w:line="360" w:lineRule="auto"/>
-        <w:jc w:val="both"/>
-        <w:rPr>
-          <w:rFonts w:ascii="Arial" w:hAnsi="Arial" w:cs="Arial"/>
-          <w:lang w:eastAsia="es-EC"/>
-        </w:rPr>
-      </w:pPr>
-      <w:r>
-        <w:rPr>
-          <w:rFonts w:ascii="Arial" w:hAnsi="Arial" w:cs="Arial"/>
-          <w:lang w:eastAsia="es-EC"/>
-        </w:rPr>
-        <w:t>(REDACTAR DE MANERA PERONAL POR QUE ES IMPORTANTE)</w:t>
-      </w:r>
-    </w:p>
-    <w:p>
-      <w:pPr>
-        <w:spacing w:line="360" w:lineRule="auto"/>
-        <w:jc w:val="both"/>
-        <w:rPr>
-          <w:rFonts w:ascii="Arial" w:hAnsi="Arial" w:cs="Arial"/>
-          <w:lang w:eastAsia="es-EC"/>
-        </w:rPr>
-      </w:pPr>
-    </w:p>
-    <w:p>
-      <w:pPr>
-        <w:pStyle w:val="Sinespaciado"/>
-        <w:jc w:val="both"/>
-        <w:rPr>
-          <w:rFonts w:ascii="Arial" w:hAnsi="Arial" w:cs="Arial"/>
-          <w:b/>
-          <w:bCs/>
-          <w:lang w:eastAsia="es-EC"/>
-        </w:rPr>
-      </w:pPr>
-      <w:r>
-        <w:rPr>
-          <w:rFonts w:ascii="Arial" w:hAnsi="Arial" w:cs="Arial"/>
-          <w:b/>
-          <w:bCs/>
-          <w:lang w:eastAsia="es-EC"/>
-        </w:rPr>
-        <w:t xml:space="preserve">5. </w:t>
-      </w:r>
-      <w:r>
-        <w:rPr>
-          <w:rFonts w:ascii="Arial" w:hAnsi="Arial" w:cs="Arial"/>
-          <w:b/>
-          <w:bCs/>
-          <w:lang w:eastAsia="es-EC"/>
-        </w:rPr>
-        <w:t>Evidencias</w:t>
+        <w:t xml:space="preserve"> Y UNA PEQUEÑA DESCRIPCION)</w:t>
       </w:r>
     </w:p>
     <w:p>
@@ -4204,48 +4742,60 @@
           <w:between w:val="nil"/>
         </w:pBdr>
         <w:spacing w:after="0" w:line="240" w:lineRule="auto"/>
-        <w:jc w:val="both"/>
-        <w:rPr>
-          <w:rFonts w:ascii="Arial" w:eastAsia="Arial" w:hAnsi="Arial" w:cs="Arial"/>
+        <w:jc w:val="center"/>
+        <w:rPr>
+          <w:rFonts w:ascii="Arial" w:hAnsi="Arial" w:cs="Arial"/>
           <w:i/>
           <w:iCs/>
-          <w:color w:val="000000"/>
-          <w:sz w:val="20"/>
-          <w:szCs w:val="20"/>
-        </w:rPr>
-      </w:pPr>
-      <w:r>
-        <w:rPr>
-          <w:rFonts w:ascii="Arial" w:eastAsia="Arial" w:hAnsi="Arial" w:cs="Arial"/>
+          <w:sz w:val="24"/>
+          <w:szCs w:val="24"/>
+          <w:lang w:eastAsia="es-EC"/>
+        </w:rPr>
+      </w:pPr>
+      <w:r>
+        <w:rPr>
+          <w:rFonts w:ascii="Arial" w:hAnsi="Arial" w:cs="Arial"/>
           <w:i/>
           <w:iCs/>
-          <w:color w:val="000000"/>
-          <w:sz w:val="20"/>
-          <w:szCs w:val="20"/>
-        </w:rPr>
-        <w:t>(ESPACIO PARA IMAGEN</w:t>
-      </w:r>
-      <w:r>
-        <w:rPr>
-          <w:rFonts w:ascii="Arial" w:eastAsia="Arial" w:hAnsi="Arial" w:cs="Arial"/>
-          <w:i/>
-          <w:iCs/>
-          <w:color w:val="000000"/>
-          <w:sz w:val="20"/>
-          <w:szCs w:val="20"/>
-        </w:rPr>
-        <w:t>ES</w:t>
-      </w:r>
-      <w:r>
-        <w:rPr>
-          <w:rFonts w:ascii="Arial" w:eastAsia="Arial" w:hAnsi="Arial" w:cs="Arial"/>
-          <w:i/>
-          <w:iCs/>
-          <w:color w:val="000000"/>
-          <w:sz w:val="20"/>
-          <w:szCs w:val="20"/>
-        </w:rPr>
-        <w:t xml:space="preserve"> Y UNA PEQUEÑA DESCRIPCION)</w:t>
+          <w:sz w:val="24"/>
+          <w:szCs w:val="24"/>
+          <w:lang w:eastAsia="es-EC"/>
+        </w:rPr>
+        <w:drawing>
+          <wp:inline distT="0" distB="0" distL="0" distR="0" wp14:anchorId="61CB7D5C" wp14:editId="28708FAF">
+            <wp:extent cx="5400040" cy="3151505"/>
+            <wp:effectExtent l="0" t="0" r="0" b="0"/>
+            <wp:docPr id="1720565970" name="Imagen 1"/>
+            <wp:cNvGraphicFramePr>
+              <a:graphicFrameLocks xmlns:a="http://schemas.openxmlformats.org/drawingml/2006/main" noChangeAspect="1"/>
+            </wp:cNvGraphicFramePr>
+            <a:graphic xmlns:a="http://schemas.openxmlformats.org/drawingml/2006/main">
+              <a:graphicData uri="http://schemas.openxmlformats.org/drawingml/2006/picture">
+                <pic:pic xmlns:pic="http://schemas.openxmlformats.org/drawingml/2006/picture">
+                  <pic:nvPicPr>
+                    <pic:cNvPr id="1720565970" name=""/>
+                    <pic:cNvPicPr/>
+                  </pic:nvPicPr>
+                  <pic:blipFill>
+                    <a:blip r:embed="rId19"/>
+                    <a:stretch>
+                      <a:fillRect/>
+                    </a:stretch>
+                  </pic:blipFill>
+                  <pic:spPr>
+                    <a:xfrm>
+                      <a:off x="0" y="0"/>
+                      <a:ext cx="5400040" cy="3151505"/>
+                    </a:xfrm>
+                    <a:prstGeom prst="rect">
+                      <a:avLst/>
+                    </a:prstGeom>
+                  </pic:spPr>
+                </pic:pic>
+              </a:graphicData>
+            </a:graphic>
+          </wp:inline>
+        </w:drawing>
       </w:r>
     </w:p>
     <w:p>
@@ -4262,13 +4812,24 @@
         <w:jc w:val="center"/>
         <w:rPr>
           <w:rFonts w:ascii="Arial" w:hAnsi="Arial" w:cs="Arial"/>
-          <w:b/>
-          <w:bCs/>
+          <w:i/>
+          <w:iCs/>
           <w:sz w:val="24"/>
           <w:szCs w:val="24"/>
           <w:lang w:eastAsia="es-EC"/>
         </w:rPr>
       </w:pPr>
+      <w:r>
+        <w:rPr>
+          <w:rFonts w:ascii="Arial" w:hAnsi="Arial" w:cs="Arial"/>
+          <w:i/>
+          <w:iCs/>
+          <w:sz w:val="24"/>
+          <w:szCs w:val="24"/>
+          <w:lang w:eastAsia="es-EC"/>
+        </w:rPr>
+        <w:t>Subida de análisis del problema</w:t>
+      </w:r>
     </w:p>
     <w:p>
       <w:pPr>
@@ -4304,16 +4865,6 @@
         </w:pBdr>
         <w:spacing w:after="0" w:line="240" w:lineRule="auto"/>
         <w:rPr>
-          <w:rFonts w:ascii="Arial" w:eastAsiaTheme="majorEastAsia" w:hAnsi="Arial" w:cs="Arial"/>
-          <w:i/>
-          <w:iCs/>
-          <w:sz w:val="20"/>
-          <w:szCs w:val="20"/>
-          <w:lang w:eastAsia="es-EC"/>
-        </w:rPr>
-      </w:pPr>
-      <w:r>
-        <w:rPr>
           <w:rFonts w:ascii="Arial" w:hAnsi="Arial" w:cs="Arial"/>
           <w:i/>
           <w:iCs/>
@@ -4321,7 +4872,63 @@
           <w:szCs w:val="24"/>
           <w:lang w:eastAsia="es-EC"/>
         </w:rPr>
+      </w:pPr>
+      <w:r>
+        <w:rPr>
+          <w:rFonts w:ascii="Arial" w:hAnsi="Arial" w:cs="Arial"/>
+          <w:i/>
+          <w:iCs/>
+          <w:sz w:val="24"/>
+          <w:szCs w:val="24"/>
+          <w:lang w:eastAsia="es-EC"/>
+        </w:rPr>
         <w:br w:type="page"/>
+      </w:r>
+      <w:r>
+        <w:rPr>
+          <w:rFonts w:ascii="Arial" w:hAnsi="Arial" w:cs="Arial"/>
+          <w:i/>
+          <w:iCs/>
+          <w:sz w:val="24"/>
+          <w:szCs w:val="24"/>
+          <w:lang w:eastAsia="es-EC"/>
+        </w:rPr>
+        <w:lastRenderedPageBreak/>
+        <w:drawing>
+          <wp:inline distT="0" distB="0" distL="0" distR="0" wp14:anchorId="4085E25D" wp14:editId="78EAB066">
+            <wp:extent cx="5400040" cy="3042920"/>
+            <wp:effectExtent l="0" t="0" r="0" b="5080"/>
+            <wp:docPr id="2094934985" name="Imagen 1"/>
+            <wp:cNvGraphicFramePr>
+              <a:graphicFrameLocks xmlns:a="http://schemas.openxmlformats.org/drawingml/2006/main" noChangeAspect="1"/>
+            </wp:cNvGraphicFramePr>
+            <a:graphic xmlns:a="http://schemas.openxmlformats.org/drawingml/2006/main">
+              <a:graphicData uri="http://schemas.openxmlformats.org/drawingml/2006/picture">
+                <pic:pic xmlns:pic="http://schemas.openxmlformats.org/drawingml/2006/picture">
+                  <pic:nvPicPr>
+                    <pic:cNvPr id="2094934985" name=""/>
+                    <pic:cNvPicPr/>
+                  </pic:nvPicPr>
+                  <pic:blipFill>
+                    <a:blip r:embed="rId20"/>
+                    <a:stretch>
+                      <a:fillRect/>
+                    </a:stretch>
+                  </pic:blipFill>
+                  <pic:spPr>
+                    <a:xfrm>
+                      <a:off x="0" y="0"/>
+                      <a:ext cx="5400040" cy="3042920"/>
+                    </a:xfrm>
+                    <a:prstGeom prst="rect">
+                      <a:avLst/>
+                    </a:prstGeom>
+                  </pic:spPr>
+                </pic:pic>
+              </a:graphicData>
+            </a:graphic>
+          </wp:inline>
+        </w:drawing>
       </w:r>
     </w:p>
     <w:p>
@@ -4340,11 +4947,22 @@
           <w:rFonts w:ascii="Arial" w:hAnsi="Arial" w:cs="Arial"/>
           <w:i/>
           <w:iCs/>
-          <w:sz w:val="20"/>
-          <w:szCs w:val="20"/>
-          <w:lang w:eastAsia="es-EC"/>
-        </w:rPr>
-      </w:pPr>
+          <w:sz w:val="24"/>
+          <w:szCs w:val="24"/>
+          <w:lang w:eastAsia="es-EC"/>
+        </w:rPr>
+      </w:pPr>
+      <w:r>
+        <w:rPr>
+          <w:rFonts w:ascii="Arial" w:hAnsi="Arial" w:cs="Arial"/>
+          <w:i/>
+          <w:iCs/>
+          <w:sz w:val="24"/>
+          <w:szCs w:val="24"/>
+          <w:lang w:eastAsia="es-EC"/>
+        </w:rPr>
+        <w:t>Subida de los Diagramas de Diseño</w:t>
+      </w:r>
     </w:p>
     <w:p>
       <w:pPr>
@@ -4360,6 +4978,50 @@
         <w:jc w:val="center"/>
         <w:rPr>
           <w:rFonts w:ascii="Arial" w:eastAsiaTheme="majorEastAsia" w:hAnsi="Arial" w:cs="Arial"/>
+          <w:i/>
+          <w:iCs/>
+          <w:sz w:val="20"/>
+          <w:szCs w:val="20"/>
+          <w:lang w:eastAsia="es-EC"/>
+        </w:rPr>
+      </w:pPr>
+    </w:p>
+    <w:p>
+      <w:pPr>
+        <w:widowControl w:val="0"/>
+        <w:pBdr>
+          <w:top w:val="nil"/>
+          <w:left w:val="nil"/>
+          <w:bottom w:val="nil"/>
+          <w:right w:val="nil"/>
+          <w:between w:val="nil"/>
+        </w:pBdr>
+        <w:spacing w:after="0" w:line="240" w:lineRule="auto"/>
+        <w:jc w:val="center"/>
+        <w:rPr>
+          <w:rFonts w:ascii="Arial" w:hAnsi="Arial" w:cs="Arial"/>
+          <w:i/>
+          <w:iCs/>
+          <w:sz w:val="20"/>
+          <w:szCs w:val="20"/>
+          <w:lang w:eastAsia="es-EC"/>
+        </w:rPr>
+      </w:pPr>
+    </w:p>
+    <w:p>
+      <w:pPr>
+        <w:widowControl w:val="0"/>
+        <w:pBdr>
+          <w:top w:val="nil"/>
+          <w:left w:val="nil"/>
+          <w:bottom w:val="nil"/>
+          <w:right w:val="nil"/>
+          <w:between w:val="nil"/>
+        </w:pBdr>
+        <w:spacing w:after="0" w:line="240" w:lineRule="auto"/>
+        <w:jc w:val="center"/>
+        <w:rPr>
+          <w:rFonts w:ascii="Arial" w:eastAsiaTheme="majorEastAsia" w:hAnsi="Arial" w:cs="Arial"/>
           <w:b/>
           <w:bCs/>
           <w:i/>
@@ -4433,7 +5095,7 @@
           <w:szCs w:val="20"/>
         </w:rPr>
       </w:pPr>
-      <w:hyperlink r:id="rId14" w:history="1">
+      <w:hyperlink r:id="rId21" w:history="1">
         <w:r>
           <w:rPr>
             <w:rStyle w:val="Hipervnculo"/>
@@ -4619,7 +5281,7 @@
         </w:rPr>
         <w:t xml:space="preserve"> </w:t>
       </w:r>
-      <w:hyperlink r:id="rId15" w:history="1">
+      <w:hyperlink r:id="rId22" w:history="1">
         <w:r>
           <w:rPr>
             <w:rStyle w:val="Hipervnculo"/>
@@ -4689,7 +5351,7 @@
         </w:rPr>
         <w:t xml:space="preserve">Serrano Preciado, O. A., Valencia Moreno, J. M., Osorio Cayetano, O. R., &amp; Wagner Gutiérrez, J. M. (2024). Sistema para la gestión de incidencias de cómputo en una universidad pública. Revista De Investigación En Tecnologías De La Información, 12(26), 179–193. </w:t>
       </w:r>
-      <w:hyperlink r:id="rId16" w:history="1">
+      <w:hyperlink r:id="rId23" w:history="1">
         <w:r>
           <w:rPr>
             <w:rStyle w:val="Hipervnculo"/>
@@ -4807,7 +5469,7 @@
         </w:rPr>
         <w:t xml:space="preserve"> </w:t>
       </w:r>
-      <w:hyperlink r:id="rId17" w:history="1">
+      <w:hyperlink r:id="rId24" w:history="1">
         <w:r>
           <w:rPr>
             <w:rStyle w:val="Hipervnculo"/>
@@ -4927,7 +5589,7 @@
         </w:rPr>
         <w:t xml:space="preserve"> sobre Git. </w:t>
       </w:r>
-      <w:hyperlink r:id="rId18" w:history="1">
+      <w:hyperlink r:id="rId25" w:history="1">
         <w:r>
           <w:rPr>
             <w:rStyle w:val="Hipervnculo"/>
@@ -4986,7 +5648,7 @@
         </w:rPr>
         <w:t xml:space="preserve">Rodríguez Barajas, C. T. (2017). Impacto de los requerimientos en la calidad de software. Tecnología Investigación y Academia, 5(2), 161–173. </w:t>
       </w:r>
-      <w:hyperlink r:id="rId19" w:history="1">
+      <w:hyperlink r:id="rId26" w:history="1">
         <w:r>
           <w:rPr>
             <w:rStyle w:val="Hipervnculo"/>
@@ -5081,7 +5743,7 @@
       </w:pPr>
     </w:p>
     <w:sectPr>
-      <w:headerReference w:type="first" r:id="rId20"/>
+      <w:headerReference w:type="first" r:id="rId27"/>
       <w:pgSz w:w="11906" w:h="16838"/>
       <w:pgMar w:top="1417" w:right="1701" w:bottom="1417" w:left="1701" w:header="708" w:footer="708" w:gutter="0"/>
       <w:pgNumType w:start="1"/>

</xml_diff>